<commit_message>
fix : second patch
</commit_message>
<xml_diff>
--- a/rapport/components/chap4.docx
+++ b/rapport/components/chap4.docx
@@ -4,6 +4,7 @@
   <w:body>
     <w:p>
       <w:pPr>
+        <w:pStyle w:val="837"/>
         <w:pBdr/>
         <w:spacing/>
         <w:ind/>
@@ -13,7 +14,7 @@
         <w:rPr>
           <w:highlight w:val="none"/>
         </w:rPr>
-        <w:t xml:space="preserve">Chap 4 : </w:t>
+        <w:t xml:space="preserve">CHAP 4 : </w:t>
       </w:r>
       <w:r>
         <w:t xml:space="preserve">MODÉLISATION DU DOMAINE</w:t>
@@ -27,6 +28,7 @@
     </w:p>
     <w:p>
       <w:pPr>
+        <w:pStyle w:val="838"/>
         <w:pBdr/>
         <w:spacing/>
         <w:ind/>
@@ -45,7 +47,7 @@
           <w:sz w:val="28"/>
           <w:szCs w:val="28"/>
         </w:rPr>
-        <w:t xml:space="preserve">4.1 Introduction</w:t>
+        <w:t xml:space="preserve">4.1. Introduction</w:t>
       </w:r>
       <w:r>
         <w:rPr>
@@ -95,6 +97,14 @@
           <w:highlight w:val="none"/>
         </w:rPr>
       </w:r>
+      <w:r>
+        <w:rPr>
+          <w:rFonts w:ascii="Arial" w:hAnsi="Arial" w:eastAsia="Arial" w:cs="Arial"/>
+          <w:sz w:val="24"/>
+          <w:szCs w:val="24"/>
+          <w:highlight w:val="none"/>
+        </w:rPr>
+      </w:r>
     </w:p>
     <w:p>
       <w:pPr>
@@ -123,13 +133,14 @@
     </w:p>
     <w:p>
       <w:pPr>
+        <w:pStyle w:val="838"/>
         <w:pBdr/>
         <w:spacing/>
         <w:ind/>
         <w:rPr/>
       </w:pPr>
       <w:r>
-        <w:t xml:space="preserve">4.2 Règles de gestion</w:t>
+        <w:t xml:space="preserve">4.2. Règles de gestion</w:t>
       </w:r>
       <w:r/>
     </w:p>
@@ -140,11 +151,9 @@
         <w:ind/>
         <w:rPr/>
       </w:pPr>
-      <w:r/>
       <w:r>
         <w:t xml:space="preserve">Les règles de gestion définissent les contraintes que le système doit respecter afin d’assurer la cohérence des données et le bon déroulement des opérations. Elles ont été établies à partir des besoins identifiés auprès des différents acteurs du projet.</w:t>
       </w:r>
-      <w:r/>
       <w:r/>
     </w:p>
     <w:p>
@@ -168,16 +177,12 @@
         </w:pBdr>
         <w:spacing/>
         <w:ind w:right="0" w:firstLine="0" w:left="0"/>
-        <w:rPr/>
+        <w:rPr>
+          <w14:ligatures w14:val="none"/>
+        </w:rPr>
       </w:pPr>
       <w:r>
-        <w:rPr>
-          <w:rFonts w:ascii="Times New Roman" w:hAnsi="Times New Roman" w:eastAsia="Times New Roman" w:cs="Times New Roman"/>
-          <w:b/>
-          <w:color w:val="000000"/>
-          <w:sz w:val="28"/>
-        </w:rPr>
-        <w:t xml:space="preserve">4.2.1 Gestion des utilisateurs et des accès</w:t>
+        <w:t xml:space="preserve">4.2.1. Gestion des utilisateurs et des accès</w:t>
       </w:r>
       <w:r/>
     </w:p>
@@ -655,15 +660,11 @@
         </w:pBdr>
         <w:spacing/>
         <w:ind w:right="0" w:firstLine="0" w:left="0"/>
-        <w:rPr/>
+        <w:rPr>
+          <w14:ligatures w14:val="none"/>
+        </w:rPr>
       </w:pPr>
       <w:r>
-        <w:rPr>
-          <w:rFonts w:ascii="Times New Roman" w:hAnsi="Times New Roman" w:eastAsia="Times New Roman" w:cs="Times New Roman"/>
-          <w:b/>
-          <w:color w:val="000000"/>
-          <w:sz w:val="28"/>
-        </w:rPr>
         <w:t xml:space="preserve">4.2.2 Gestion des projets et des conventions</w:t>
       </w:r>
       <w:r/>
@@ -899,11 +900,9 @@
               <w:ind/>
               <w:rPr/>
             </w:pPr>
-            <w:r/>
             <w:r>
               <w:t xml:space="preserve">Une convention ne peut être associée qu’à un seul projet et un seul bailleur.</w:t>
             </w:r>
-            <w:r/>
             <w:r>
               <w:rPr>
                 <w:rFonts w:ascii="Times New Roman" w:hAnsi="Times New Roman" w:eastAsia="Times New Roman" w:cs="Times New Roman"/>
@@ -1291,15 +1290,11 @@
         </w:pBdr>
         <w:spacing/>
         <w:ind w:right="0" w:firstLine="0" w:left="0"/>
-        <w:rPr/>
+        <w:rPr>
+          <w14:ligatures w14:val="none"/>
+        </w:rPr>
       </w:pPr>
       <w:r>
-        <w:rPr>
-          <w:rFonts w:ascii="Times New Roman" w:hAnsi="Times New Roman" w:eastAsia="Times New Roman" w:cs="Times New Roman"/>
-          <w:b/>
-          <w:color w:val="000000"/>
-          <w:sz w:val="28"/>
-        </w:rPr>
         <w:t xml:space="preserve">4.2.3 Circuit des dépenses</w:t>
       </w:r>
       <w:r/>
@@ -1933,15 +1928,11 @@
         </w:pBdr>
         <w:spacing/>
         <w:ind w:right="0" w:firstLine="0" w:left="0"/>
-        <w:rPr/>
+        <w:rPr>
+          <w14:ligatures w14:val="none"/>
+        </w:rPr>
       </w:pPr>
       <w:r>
-        <w:rPr>
-          <w:rFonts w:ascii="Times New Roman" w:hAnsi="Times New Roman" w:eastAsia="Times New Roman" w:cs="Times New Roman"/>
-          <w:b/>
-          <w:color w:val="000000"/>
-          <w:sz w:val="28"/>
-        </w:rPr>
         <w:t xml:space="preserve">4.2.4 Clôture et reporting</w:t>
       </w:r>
       <w:r/>
@@ -2420,15 +2411,11 @@
         </w:pBdr>
         <w:spacing/>
         <w:ind w:right="0" w:firstLine="0" w:left="0"/>
-        <w:rPr/>
+        <w:rPr>
+          <w14:ligatures w14:val="none"/>
+        </w:rPr>
       </w:pPr>
       <w:r>
-        <w:rPr>
-          <w:rFonts w:ascii="Times New Roman" w:hAnsi="Times New Roman" w:eastAsia="Times New Roman" w:cs="Times New Roman"/>
-          <w:b/>
-          <w:color w:val="000000"/>
-          <w:sz w:val="28"/>
-        </w:rPr>
         <w:t xml:space="preserve">4.2.5 Assistance et communication</w:t>
       </w:r>
       <w:r/>
@@ -2600,6 +2587,101 @@
               <w:t xml:space="preserve">Les contenus d’assistance sont affichés selon le rôle de l’utilisateur.</w:t>
             </w:r>
             <w:r/>
+          </w:p>
+        </w:tc>
+      </w:tr>
+      <w:tr>
+        <w:trPr/>
+        <w:tc>
+          <w:tcPr>
+            <w:tcBorders>
+              <w:top w:val="single" w:color="000000" w:sz="4" w:space="0"/>
+              <w:left w:val="single" w:color="000000" w:sz="4" w:space="0"/>
+              <w:bottom w:val="single" w:color="000000" w:sz="4" w:space="0"/>
+              <w:right w:val="single" w:color="000000" w:sz="4" w:space="0"/>
+            </w:tcBorders>
+            <w:tcMar>
+              <w:left w:w="15" w:type="dxa"/>
+              <w:top w:w="15" w:type="dxa"/>
+              <w:right w:w="15" w:type="dxa"/>
+              <w:bottom w:w="15" w:type="dxa"/>
+            </w:tcMar>
+            <w:tcW w:w="573" w:type="dxa"/>
+            <w:vAlign w:val="center"/>
+            <w:vMerge w:val="restart"/>
+          </w:tcPr>
+          <w:p>
+            <w:pPr>
+              <w:pBdr/>
+              <w:spacing w:after="0" w:before="0" w:line="240" w:lineRule="auto"/>
+              <w:ind/>
+              <w:rPr>
+                <w:rFonts w:ascii="Times New Roman" w:hAnsi="Times New Roman" w:eastAsia="Times New Roman" w:cs="Times New Roman"/>
+                <w:color w:val="000000"/>
+                <w:sz w:val="24"/>
+              </w:rPr>
+            </w:pPr>
+            <w:r>
+              <w:rPr>
+                <w:rFonts w:ascii="Times New Roman" w:hAnsi="Times New Roman" w:eastAsia="Times New Roman" w:cs="Times New Roman"/>
+                <w:color w:val="000000"/>
+                <w:sz w:val="24"/>
+              </w:rPr>
+              <w:t xml:space="preserve">RG26</w:t>
+            </w:r>
+            <w:r>
+              <w:rPr>
+                <w:rFonts w:ascii="Times New Roman" w:hAnsi="Times New Roman" w:eastAsia="Times New Roman" w:cs="Times New Roman"/>
+                <w:color w:val="000000"/>
+                <w:sz w:val="24"/>
+              </w:rPr>
+            </w:r>
+          </w:p>
+        </w:tc>
+        <w:tc>
+          <w:tcPr>
+            <w:tcBorders>
+              <w:top w:val="single" w:color="000000" w:sz="4" w:space="0"/>
+              <w:left w:val="single" w:color="000000" w:sz="4" w:space="0"/>
+              <w:bottom w:val="single" w:color="000000" w:sz="4" w:space="0"/>
+              <w:right w:val="single" w:color="000000" w:sz="4" w:space="0"/>
+            </w:tcBorders>
+            <w:tcMar>
+              <w:left w:w="15" w:type="dxa"/>
+              <w:top w:w="15" w:type="dxa"/>
+              <w:right w:w="15" w:type="dxa"/>
+              <w:bottom w:w="15" w:type="dxa"/>
+            </w:tcMar>
+            <w:tcW w:w="8048" w:type="dxa"/>
+            <w:vAlign w:val="center"/>
+            <w:vMerge w:val="restart"/>
+          </w:tcPr>
+          <w:p>
+            <w:pPr>
+              <w:pBdr/>
+              <w:spacing w:after="0" w:before="0" w:line="240" w:lineRule="auto"/>
+              <w:ind/>
+              <w:rPr>
+                <w:rFonts w:ascii="Times New Roman" w:hAnsi="Times New Roman" w:eastAsia="Times New Roman" w:cs="Times New Roman"/>
+                <w:color w:val="000000"/>
+                <w:sz w:val="24"/>
+              </w:rPr>
+            </w:pPr>
+            <w:r>
+              <w:rPr>
+                <w:rFonts w:ascii="Times New Roman" w:hAnsi="Times New Roman" w:eastAsia="Times New Roman" w:cs="Times New Roman"/>
+                <w:color w:val="000000"/>
+                <w:sz w:val="24"/>
+              </w:rPr>
+              <w:t xml:space="preserve">Tout utilisateur a accès au chat mais le porteur de projet ne peux pas communiquer avec un autre porteur, juste avec daf,ac,admin</w:t>
+            </w:r>
+            <w:r>
+              <w:rPr>
+                <w:rFonts w:ascii="Times New Roman" w:hAnsi="Times New Roman" w:eastAsia="Times New Roman" w:cs="Times New Roman"/>
+                <w:color w:val="000000"/>
+                <w:sz w:val="24"/>
+              </w:rPr>
+            </w:r>
           </w:p>
         </w:tc>
       </w:tr>
@@ -2635,6 +2717,7 @@
     </w:p>
     <w:p>
       <w:pPr>
+        <w:pStyle w:val="838"/>
         <w:pBdr/>
         <w:spacing/>
         <w:ind/>
@@ -2693,6 +2776,13 @@
         </w:rPr>
         <w:t xml:space="preserve">
 </w:t>
+      </w:r>
+      <w:r>
+        <w:rPr>
+          <w:sz w:val="24"/>
+          <w:szCs w:val="24"/>
+          <w:highlight w:val="none"/>
+        </w:rPr>
       </w:r>
       <w:r>
         <w:rPr>
@@ -2750,13 +2840,6 @@
           <w:highlight w:val="none"/>
         </w:rPr>
       </w:r>
-      <w:r>
-        <w:rPr>
-          <w:sz w:val="24"/>
-          <w:szCs w:val="24"/>
-          <w:highlight w:val="none"/>
-        </w:rPr>
-      </w:r>
     </w:p>
     <w:p>
       <w:pPr>
@@ -2994,14 +3077,7 @@
             </w:r>
             <w:r>
               <w:rPr>
-                <w:rFonts w:ascii="Arial" w:hAnsi="Arial" w:eastAsia="Arial" w:cs="Arial"/>
-                <w:b w:val="0"/>
-                <w:i w:val="0"/>
-                <w:strike w:val="0"/>
-                <w:color w:val="000000"/>
-                <w:sz w:val="23"/>
-                <w:u w:val="none"/>
-                <w:vertAlign w:val="baseline"/>
+                <w:highlight w:val="none"/>
               </w:rPr>
             </w:r>
             <w:r>
@@ -4338,7 +4414,11 @@
       </w:r>
       <w:r>
         <w:rPr>
-          <w:highlight w:val="none"/>
+          <w:rFonts w:ascii="Arial" w:hAnsi="Arial" w:eastAsia="Arial" w:cs="Arial"/>
+          <w:color w:val="0f1115"/>
+          <w:sz w:val="24"/>
+          <w:szCs w:val="24"/>
+          <w:highlight w:val="white"/>
         </w:rPr>
       </w:r>
       <w:r>
@@ -4362,15 +4442,11 @@
         </w:pBdr>
         <w:spacing/>
         <w:ind w:right="0" w:firstLine="0" w:left="0"/>
-        <w:rPr/>
+        <w:rPr>
+          <w14:ligatures w14:val="none"/>
+        </w:rPr>
       </w:pPr>
       <w:r>
-        <w:rPr>
-          <w:rFonts w:ascii="Times New Roman" w:hAnsi="Times New Roman" w:eastAsia="Times New Roman" w:cs="Times New Roman"/>
-          <w:b/>
-          <w:color w:val="000000"/>
-          <w:sz w:val="36"/>
-        </w:rPr>
         <w:t xml:space="preserve">4.4 Dictionnaire des données</w:t>
       </w:r>
       <w:r/>
@@ -4407,17 +4483,21 @@
           <w:sz w:val="24"/>
         </w:rPr>
       </w:r>
+      <w:r>
+        <w:rPr>
+          <w:rFonts w:ascii="Times New Roman" w:hAnsi="Times New Roman" w:eastAsia="Times New Roman" w:cs="Times New Roman"/>
+          <w:color w:val="000000"/>
+          <w:sz w:val="24"/>
+          <w:szCs w:val="24"/>
+          <w:highlight w:val="none"/>
+        </w:rPr>
+      </w:r>
     </w:p>
     <w:p>
       <w:pPr>
-        <w:pBdr>
-          <w:top w:val="none" w:color="000000" w:sz="4" w:space="0"/>
-          <w:left w:val="none" w:color="000000" w:sz="4" w:space="0"/>
-          <w:bottom w:val="none" w:color="000000" w:sz="4" w:space="0"/>
-          <w:right w:val="none" w:color="000000" w:sz="4" w:space="0"/>
-        </w:pBdr>
-        <w:spacing/>
-        <w:ind w:right="0" w:firstLine="0" w:left="0"/>
+        <w:pBdr/>
+        <w:spacing/>
+        <w:ind/>
         <w:rPr>
           <w:rFonts w:ascii="Times New Roman" w:hAnsi="Times New Roman" w:eastAsia="Times New Roman" w:cs="Times New Roman"/>
           <w:sz w:val="24"/>
@@ -4443,15 +4523,13 @@
       <w:r>
         <w:rPr>
           <w:rFonts w:ascii="Times New Roman" w:hAnsi="Times New Roman" w:eastAsia="Times New Roman" w:cs="Times New Roman"/>
-          <w:color w:val="000000"/>
           <w:sz w:val="24"/>
-          <w:highlight w:val="none"/>
+          <w:szCs w:val="24"/>
         </w:rPr>
       </w:r>
     </w:p>
     <w:p>
       <w:pPr>
-        <w:pStyle w:val="838"/>
         <w:pBdr/>
         <w:spacing/>
         <w:ind/>
@@ -4460,7 +4538,6 @@
       <w:r>
         <w:t xml:space="preserve">Classe Utilisateur</w:t>
       </w:r>
-      <w:r/>
       <w:r/>
     </w:p>
     <w:tbl>
@@ -4494,7 +4571,6 @@
               <w:t xml:space="preserve">Nom</w:t>
             </w:r>
             <w:r/>
-            <w:r/>
           </w:p>
         </w:tc>
         <w:tc>
@@ -4513,7 +4589,6 @@
               <w:t xml:space="preserve">Désignation</w:t>
             </w:r>
             <w:r/>
-            <w:r/>
           </w:p>
         </w:tc>
         <w:tc>
@@ -4532,7 +4607,6 @@
               <w:t xml:space="preserve">Type SQL</w:t>
             </w:r>
             <w:r/>
-            <w:r/>
           </w:p>
         </w:tc>
         <w:tc>
@@ -4550,7 +4624,6 @@
             <w:r>
               <w:t xml:space="preserve">Taille</w:t>
             </w:r>
-            <w:r/>
             <w:r/>
           </w:p>
         </w:tc>
@@ -4573,7 +4646,6 @@
               <w:t xml:space="preserve">id_utilisateur</w:t>
             </w:r>
             <w:r/>
-            <w:r/>
           </w:p>
         </w:tc>
         <w:tc>
@@ -4592,7 +4664,6 @@
               <w:t xml:space="preserve">Identifiant de l'utilisateur</w:t>
             </w:r>
             <w:r/>
-            <w:r/>
           </w:p>
         </w:tc>
         <w:tc>
@@ -4611,7 +4682,6 @@
               <w:t xml:space="preserve">INT</w:t>
             </w:r>
             <w:r/>
-            <w:r/>
           </w:p>
         </w:tc>
         <w:tc>
@@ -4629,7 +4699,6 @@
             <w:r>
               <w:t xml:space="preserve">20</w:t>
             </w:r>
-            <w:r/>
             <w:r/>
           </w:p>
         </w:tc>
@@ -4648,14 +4717,12 @@
               <w:ind/>
               <w:rPr/>
             </w:pPr>
-            <w:r/>
             <w:r>
               <w:t xml:space="preserve">utilisateur</w:t>
             </w:r>
             <w:r>
               <w:t xml:space="preserve">_nom</w:t>
             </w:r>
-            <w:r/>
             <w:r/>
           </w:p>
         </w:tc>
@@ -4675,7 +4742,6 @@
               <w:t xml:space="preserve">Nom complet de l'utilisateur</w:t>
             </w:r>
             <w:r/>
-            <w:r/>
           </w:p>
         </w:tc>
         <w:tc>
@@ -4694,7 +4760,6 @@
               <w:t xml:space="preserve">VARCHAR</w:t>
             </w:r>
             <w:r/>
-            <w:r/>
           </w:p>
         </w:tc>
         <w:tc>
@@ -4712,7 +4777,6 @@
             <w:r>
               <w:t xml:space="preserve">100</w:t>
             </w:r>
-            <w:r/>
             <w:r/>
           </w:p>
         </w:tc>
@@ -4731,18 +4795,15 @@
               <w:ind/>
               <w:rPr/>
             </w:pPr>
-            <w:r/>
             <w:r>
               <w:t xml:space="preserve">utilisateur</w:t>
             </w:r>
             <w:r>
               <w:t xml:space="preserve">_</w:t>
             </w:r>
-            <w:r/>
             <w:r>
               <w:t xml:space="preserve">email</w:t>
             </w:r>
-            <w:r/>
             <w:r/>
           </w:p>
         </w:tc>
@@ -4762,7 +4823,6 @@
               <w:t xml:space="preserve">Adresse électronique</w:t>
             </w:r>
             <w:r/>
-            <w:r/>
           </w:p>
         </w:tc>
         <w:tc>
@@ -4781,7 +4841,6 @@
               <w:t xml:space="preserve">VARCHAR</w:t>
             </w:r>
             <w:r/>
-            <w:r/>
           </w:p>
         </w:tc>
         <w:tc>
@@ -4799,7 +4858,6 @@
             <w:r>
               <w:t xml:space="preserve">100</w:t>
             </w:r>
-            <w:r/>
             <w:r/>
           </w:p>
         </w:tc>
@@ -4818,18 +4876,15 @@
               <w:ind/>
               <w:rPr/>
             </w:pPr>
-            <w:r/>
             <w:r>
               <w:t xml:space="preserve">utilisateur</w:t>
             </w:r>
             <w:r>
               <w:t xml:space="preserve">_</w:t>
             </w:r>
-            <w:r/>
             <w:r>
               <w:t xml:space="preserve">mot_de_passe</w:t>
             </w:r>
-            <w:r/>
             <w:r/>
           </w:p>
         </w:tc>
@@ -4849,7 +4904,6 @@
               <w:t xml:space="preserve">Mot de passe chiffré</w:t>
             </w:r>
             <w:r/>
-            <w:r/>
           </w:p>
         </w:tc>
         <w:tc>
@@ -4868,7 +4922,6 @@
               <w:t xml:space="preserve">VARCHAR</w:t>
             </w:r>
             <w:r/>
-            <w:r/>
           </w:p>
         </w:tc>
         <w:tc>
@@ -4886,7 +4939,6 @@
             <w:r>
               <w:t xml:space="preserve">255</w:t>
             </w:r>
-            <w:r/>
             <w:r/>
           </w:p>
         </w:tc>
@@ -4905,18 +4957,15 @@
               <w:ind/>
               <w:rPr/>
             </w:pPr>
-            <w:r/>
             <w:r>
               <w:t xml:space="preserve">utilisateur</w:t>
             </w:r>
             <w:r>
               <w:t xml:space="preserve">_</w:t>
             </w:r>
-            <w:r/>
             <w:r>
               <w:t xml:space="preserve">role</w:t>
             </w:r>
-            <w:r/>
             <w:r/>
           </w:p>
         </w:tc>
@@ -4936,7 +4985,6 @@
               <w:t xml:space="preserve">Rôle de l'utilisateur</w:t>
             </w:r>
             <w:r/>
-            <w:r/>
           </w:p>
         </w:tc>
         <w:tc>
@@ -4955,7 +5003,6 @@
               <w:t xml:space="preserve">ENUM(admin, daf, ac, porteur)</w:t>
             </w:r>
             <w:r/>
-            <w:r/>
           </w:p>
         </w:tc>
         <w:tc>
@@ -4973,7 +5020,6 @@
             <w:r>
               <w:t xml:space="preserve">-</w:t>
             </w:r>
-            <w:r/>
             <w:r/>
           </w:p>
         </w:tc>
@@ -4992,18 +5038,15 @@
               <w:ind/>
               <w:rPr/>
             </w:pPr>
-            <w:r/>
             <w:r>
               <w:t xml:space="preserve">utilisateur</w:t>
             </w:r>
             <w:r>
               <w:t xml:space="preserve">_</w:t>
             </w:r>
-            <w:r/>
             <w:r>
               <w:t xml:space="preserve">actif</w:t>
             </w:r>
-            <w:r/>
             <w:r/>
           </w:p>
         </w:tc>
@@ -5023,7 +5066,6 @@
               <w:t xml:space="preserve">Statut du compte</w:t>
             </w:r>
             <w:r/>
-            <w:r/>
           </w:p>
         </w:tc>
         <w:tc>
@@ -5042,7 +5084,6 @@
               <w:t xml:space="preserve">BOOLEAN</w:t>
             </w:r>
             <w:r/>
-            <w:r/>
           </w:p>
         </w:tc>
         <w:tc>
@@ -5060,7 +5101,6 @@
             <w:r>
               <w:t xml:space="preserve">1</w:t>
             </w:r>
-            <w:r/>
             <w:r/>
           </w:p>
         </w:tc>
@@ -5079,18 +5119,15 @@
               <w:ind/>
               <w:rPr/>
             </w:pPr>
-            <w:r/>
             <w:r>
               <w:t xml:space="preserve">utilisateur</w:t>
             </w:r>
             <w:r>
               <w:t xml:space="preserve">_</w:t>
             </w:r>
-            <w:r/>
             <w:r>
               <w:t xml:space="preserve">telephone</w:t>
             </w:r>
-            <w:r/>
             <w:r/>
           </w:p>
         </w:tc>
@@ -5110,7 +5147,6 @@
               <w:t xml:space="preserve">Numéro de téléphone</w:t>
             </w:r>
             <w:r/>
-            <w:r/>
           </w:p>
         </w:tc>
         <w:tc>
@@ -5129,7 +5165,6 @@
               <w:t xml:space="preserve">VARCHAR</w:t>
             </w:r>
             <w:r/>
-            <w:r/>
           </w:p>
         </w:tc>
         <w:tc>
@@ -5147,7 +5182,6 @@
             <w:r>
               <w:t xml:space="preserve">20</w:t>
             </w:r>
-            <w:r/>
             <w:r/>
           </w:p>
         </w:tc>
@@ -5166,18 +5200,15 @@
               <w:ind/>
               <w:rPr/>
             </w:pPr>
-            <w:r/>
             <w:r>
               <w:t xml:space="preserve">utilisateur</w:t>
             </w:r>
             <w:r>
               <w:t xml:space="preserve">_</w:t>
             </w:r>
-            <w:r/>
             <w:r>
               <w:t xml:space="preserve">avatar_chemin</w:t>
             </w:r>
-            <w:r/>
             <w:r/>
           </w:p>
         </w:tc>
@@ -5197,7 +5228,6 @@
               <w:t xml:space="preserve">Chemin de l'avatar</w:t>
             </w:r>
             <w:r/>
-            <w:r/>
           </w:p>
         </w:tc>
         <w:tc>
@@ -5216,7 +5246,6 @@
               <w:t xml:space="preserve">VARCHAR</w:t>
             </w:r>
             <w:r/>
-            <w:r/>
           </w:p>
         </w:tc>
         <w:tc>
@@ -5234,7 +5263,6 @@
             <w:r>
               <w:t xml:space="preserve">255</w:t>
             </w:r>
-            <w:r/>
             <w:r/>
           </w:p>
         </w:tc>
@@ -5247,13 +5275,11 @@
         <w:ind/>
         <w:rPr/>
       </w:pPr>
-      <w:r/>
       <w:r/>
       <w:r/>
     </w:p>
     <w:p>
       <w:pPr>
-        <w:pStyle w:val="838"/>
         <w:pBdr/>
         <w:spacing/>
         <w:ind/>
@@ -5262,7 +5288,6 @@
       <w:r>
         <w:t xml:space="preserve">Classe Projet</w:t>
       </w:r>
-      <w:r/>
       <w:r/>
     </w:p>
     <w:tbl>
@@ -5296,7 +5321,6 @@
               <w:t xml:space="preserve">Nom</w:t>
             </w:r>
             <w:r/>
-            <w:r/>
           </w:p>
         </w:tc>
         <w:tc>
@@ -5315,7 +5339,6 @@
               <w:t xml:space="preserve">Désignation</w:t>
             </w:r>
             <w:r/>
-            <w:r/>
           </w:p>
         </w:tc>
         <w:tc>
@@ -5334,7 +5357,6 @@
               <w:t xml:space="preserve">Type SQL</w:t>
             </w:r>
             <w:r/>
-            <w:r/>
           </w:p>
         </w:tc>
         <w:tc>
@@ -5352,7 +5374,6 @@
             <w:r>
               <w:t xml:space="preserve">Taille</w:t>
             </w:r>
-            <w:r/>
             <w:r/>
           </w:p>
         </w:tc>
@@ -5375,7 +5396,6 @@
               <w:t xml:space="preserve">id_projet</w:t>
             </w:r>
             <w:r/>
-            <w:r/>
           </w:p>
         </w:tc>
         <w:tc>
@@ -5394,7 +5414,6 @@
               <w:t xml:space="preserve">Identifiant du projet</w:t>
             </w:r>
             <w:r/>
-            <w:r/>
           </w:p>
         </w:tc>
         <w:tc>
@@ -5413,7 +5432,6 @@
               <w:t xml:space="preserve">INT</w:t>
             </w:r>
             <w:r/>
-            <w:r/>
           </w:p>
         </w:tc>
         <w:tc>
@@ -5431,7 +5449,6 @@
             <w:r>
               <w:t xml:space="preserve">20</w:t>
             </w:r>
-            <w:r/>
             <w:r/>
           </w:p>
         </w:tc>
@@ -5454,7 +5471,6 @@
               <w:t xml:space="preserve">projet_titre</w:t>
             </w:r>
             <w:r/>
-            <w:r/>
           </w:p>
         </w:tc>
         <w:tc>
@@ -5473,7 +5489,6 @@
               <w:t xml:space="preserve">Titre du projet</w:t>
             </w:r>
             <w:r/>
-            <w:r/>
           </w:p>
         </w:tc>
         <w:tc>
@@ -5492,7 +5507,6 @@
               <w:t xml:space="preserve">VARCHAR</w:t>
             </w:r>
             <w:r/>
-            <w:r/>
           </w:p>
         </w:tc>
         <w:tc>
@@ -5510,7 +5524,6 @@
             <w:r>
               <w:t xml:space="preserve">150</w:t>
             </w:r>
-            <w:r/>
             <w:r/>
           </w:p>
         </w:tc>
@@ -5529,15 +5542,12 @@
               <w:ind/>
               <w:rPr/>
             </w:pPr>
-            <w:r/>
             <w:r>
               <w:t xml:space="preserve">projet_</w:t>
             </w:r>
-            <w:r/>
             <w:r>
               <w:t xml:space="preserve">description</w:t>
             </w:r>
-            <w:r/>
             <w:r/>
           </w:p>
         </w:tc>
@@ -5557,7 +5567,6 @@
               <w:t xml:space="preserve">Description du projet</w:t>
             </w:r>
             <w:r/>
-            <w:r/>
           </w:p>
         </w:tc>
         <w:tc>
@@ -5576,7 +5585,6 @@
               <w:t xml:space="preserve">TEXT</w:t>
             </w:r>
             <w:r/>
-            <w:r/>
           </w:p>
         </w:tc>
         <w:tc>
@@ -5594,7 +5602,6 @@
             <w:r>
               <w:t xml:space="preserve">-</w:t>
             </w:r>
-            <w:r/>
             <w:r/>
           </w:p>
         </w:tc>
@@ -5613,15 +5620,12 @@
               <w:ind/>
               <w:rPr/>
             </w:pPr>
-            <w:r/>
             <w:r>
               <w:t xml:space="preserve">projet_</w:t>
             </w:r>
-            <w:r/>
             <w:r>
               <w:t xml:space="preserve">activites</w:t>
             </w:r>
-            <w:r/>
             <w:r/>
           </w:p>
         </w:tc>
@@ -5641,7 +5645,6 @@
               <w:t xml:space="preserve">Activités prévues</w:t>
             </w:r>
             <w:r/>
-            <w:r/>
           </w:p>
         </w:tc>
         <w:tc>
@@ -5660,7 +5663,6 @@
               <w:t xml:space="preserve">TEXT</w:t>
             </w:r>
             <w:r/>
-            <w:r/>
           </w:p>
         </w:tc>
         <w:tc>
@@ -5678,7 +5680,6 @@
             <w:r>
               <w:t xml:space="preserve">-</w:t>
             </w:r>
-            <w:r/>
             <w:r/>
           </w:p>
         </w:tc>
@@ -5697,15 +5698,12 @@
               <w:ind/>
               <w:rPr/>
             </w:pPr>
-            <w:r/>
             <w:r>
               <w:t xml:space="preserve">projet_</w:t>
             </w:r>
-            <w:r/>
             <w:r>
               <w:t xml:space="preserve">objectifs</w:t>
             </w:r>
-            <w:r/>
             <w:r/>
           </w:p>
         </w:tc>
@@ -5725,7 +5723,6 @@
               <w:t xml:space="preserve">Objectifs du projet</w:t>
             </w:r>
             <w:r/>
-            <w:r/>
           </w:p>
         </w:tc>
         <w:tc>
@@ -5744,7 +5741,6 @@
               <w:t xml:space="preserve">TEXT</w:t>
             </w:r>
             <w:r/>
-            <w:r/>
           </w:p>
         </w:tc>
         <w:tc>
@@ -5762,7 +5758,6 @@
             <w:r>
               <w:t xml:space="preserve">-</w:t>
             </w:r>
-            <w:r/>
             <w:r/>
           </w:p>
         </w:tc>
@@ -5781,15 +5776,12 @@
               <w:ind/>
               <w:rPr/>
             </w:pPr>
-            <w:r/>
             <w:r>
               <w:t xml:space="preserve">projet_</w:t>
             </w:r>
-            <w:r/>
             <w:r>
               <w:t xml:space="preserve">montant_estime</w:t>
             </w:r>
-            <w:r/>
             <w:r/>
           </w:p>
         </w:tc>
@@ -5809,7 +5801,6 @@
               <w:t xml:space="preserve">Montant estimé du projet</w:t>
             </w:r>
             <w:r/>
-            <w:r/>
           </w:p>
         </w:tc>
         <w:tc>
@@ -5828,7 +5819,6 @@
               <w:t xml:space="preserve">DECIMAL</w:t>
             </w:r>
             <w:r/>
-            <w:r/>
           </w:p>
         </w:tc>
         <w:tc>
@@ -5846,7 +5836,6 @@
             <w:r>
               <w:t xml:space="preserve">15,2</w:t>
             </w:r>
-            <w:r/>
             <w:r/>
           </w:p>
         </w:tc>
@@ -5865,15 +5854,12 @@
               <w:ind/>
               <w:rPr/>
             </w:pPr>
-            <w:r/>
             <w:r>
               <w:t xml:space="preserve">projet_</w:t>
             </w:r>
-            <w:r/>
             <w:r>
               <w:t xml:space="preserve">statut</w:t>
             </w:r>
-            <w:r/>
             <w:r/>
           </w:p>
         </w:tc>
@@ -5893,7 +5879,6 @@
               <w:t xml:space="preserve">Statut du projet</w:t>
             </w:r>
             <w:r/>
-            <w:r/>
           </w:p>
         </w:tc>
         <w:tc>
@@ -5912,7 +5897,6 @@
               <w:t xml:space="preserve">ENUM(en_attente_financement, en_cours, suspendu, termine, annule)</w:t>
             </w:r>
             <w:r/>
-            <w:r/>
           </w:p>
         </w:tc>
         <w:tc>
@@ -5930,7 +5914,6 @@
             <w:r>
               <w:t xml:space="preserve">-</w:t>
             </w:r>
-            <w:r/>
             <w:r/>
           </w:p>
         </w:tc>
@@ -5951,12 +5934,11 @@
               <w:rPr/>
             </w:pPr>
             <w:r>
-              <w:t xml:space="preserve">Projet_</w:t>
+              <w:t xml:space="preserve">projet_</w:t>
             </w:r>
             <w:r>
               <w:t xml:space="preserve">statut_final</w:t>
             </w:r>
-            <w:r/>
             <w:r/>
           </w:p>
         </w:tc>
@@ -6033,11 +6015,9 @@
               <w:ind/>
               <w:rPr/>
             </w:pPr>
-            <w:r/>
             <w:r>
               <w:t xml:space="preserve">projet_date_fin_prevue</w:t>
             </w:r>
-            <w:r/>
             <w:r/>
           </w:p>
         </w:tc>
@@ -6054,11 +6034,9 @@
               <w:ind/>
               <w:rPr/>
             </w:pPr>
-            <w:r/>
             <w:r>
               <w:t xml:space="preserve">Date de fin prévue</w:t>
             </w:r>
-            <w:r/>
             <w:r/>
           </w:p>
         </w:tc>
@@ -6116,11 +6094,9 @@
               <w:ind/>
               <w:rPr/>
             </w:pPr>
-            <w:r/>
             <w:r>
               <w:t xml:space="preserve">projet_date_fin_reelle</w:t>
             </w:r>
-            <w:r/>
             <w:r/>
           </w:p>
         </w:tc>
@@ -6137,7 +6113,6 @@
               <w:ind/>
               <w:rPr/>
             </w:pPr>
-            <w:r/>
             <w:r>
               <w:t xml:space="preserve">Date de fin </w:t>
             </w:r>
@@ -6271,13 +6246,11 @@
         <w:ind/>
         <w:rPr/>
       </w:pPr>
-      <w:r/>
       <w:r/>
       <w:r/>
     </w:p>
     <w:p>
       <w:pPr>
-        <w:pStyle w:val="838"/>
         <w:pBdr/>
         <w:spacing/>
         <w:ind/>
@@ -6286,7 +6259,6 @@
       <w:r>
         <w:t xml:space="preserve">Classe Bailleur</w:t>
       </w:r>
-      <w:r/>
       <w:r/>
     </w:p>
     <w:tbl>
@@ -6320,7 +6292,6 @@
               <w:t xml:space="preserve">Nom</w:t>
             </w:r>
             <w:r/>
-            <w:r/>
           </w:p>
         </w:tc>
         <w:tc>
@@ -6339,7 +6310,6 @@
               <w:t xml:space="preserve">Désignation</w:t>
             </w:r>
             <w:r/>
-            <w:r/>
           </w:p>
         </w:tc>
         <w:tc>
@@ -6358,7 +6328,6 @@
               <w:t xml:space="preserve">Type SQL</w:t>
             </w:r>
             <w:r/>
-            <w:r/>
           </w:p>
         </w:tc>
         <w:tc>
@@ -6376,7 +6345,6 @@
             <w:r>
               <w:t xml:space="preserve">Taille</w:t>
             </w:r>
-            <w:r/>
             <w:r/>
           </w:p>
         </w:tc>
@@ -6399,7 +6367,6 @@
               <w:t xml:space="preserve">id_bailleur</w:t>
             </w:r>
             <w:r/>
-            <w:r/>
           </w:p>
         </w:tc>
         <w:tc>
@@ -6418,7 +6385,6 @@
               <w:t xml:space="preserve">Identifiant du bailleur</w:t>
             </w:r>
             <w:r/>
-            <w:r/>
           </w:p>
         </w:tc>
         <w:tc>
@@ -6437,7 +6403,6 @@
               <w:t xml:space="preserve">INT</w:t>
             </w:r>
             <w:r/>
-            <w:r/>
           </w:p>
         </w:tc>
         <w:tc>
@@ -6455,7 +6420,6 @@
             <w:r>
               <w:t xml:space="preserve">20</w:t>
             </w:r>
-            <w:r/>
             <w:r/>
           </w:p>
         </w:tc>
@@ -6478,7 +6442,6 @@
               <w:t xml:space="preserve">bailleur_nom</w:t>
             </w:r>
             <w:r/>
-            <w:r/>
           </w:p>
         </w:tc>
         <w:tc>
@@ -6497,7 +6460,6 @@
               <w:t xml:space="preserve">Nom du bailleur</w:t>
             </w:r>
             <w:r/>
-            <w:r/>
           </w:p>
         </w:tc>
         <w:tc>
@@ -6516,7 +6478,6 @@
               <w:t xml:space="preserve">VARCHAR</w:t>
             </w:r>
             <w:r/>
-            <w:r/>
           </w:p>
         </w:tc>
         <w:tc>
@@ -6534,7 +6495,6 @@
             <w:r>
               <w:t xml:space="preserve">100</w:t>
             </w:r>
-            <w:r/>
             <w:r/>
           </w:p>
         </w:tc>
@@ -6553,14 +6513,12 @@
               <w:ind/>
               <w:rPr/>
             </w:pPr>
-            <w:r/>
             <w:r>
               <w:t xml:space="preserve">bailleur</w:t>
             </w:r>
             <w:r>
               <w:t xml:space="preserve">_sigle</w:t>
             </w:r>
-            <w:r/>
             <w:r/>
           </w:p>
         </w:tc>
@@ -6580,7 +6538,6 @@
               <w:t xml:space="preserve">Sigle du bailleur</w:t>
             </w:r>
             <w:r/>
-            <w:r/>
           </w:p>
         </w:tc>
         <w:tc>
@@ -6599,7 +6556,6 @@
               <w:t xml:space="preserve">VARCHAR</w:t>
             </w:r>
             <w:r/>
-            <w:r/>
           </w:p>
         </w:tc>
         <w:tc>
@@ -6617,7 +6573,6 @@
             <w:r>
               <w:t xml:space="preserve">30</w:t>
             </w:r>
-            <w:r/>
             <w:r/>
           </w:p>
         </w:tc>
@@ -6636,14 +6591,12 @@
               <w:ind/>
               <w:rPr/>
             </w:pPr>
-            <w:r/>
             <w:r>
               <w:t xml:space="preserve">bailleur</w:t>
             </w:r>
             <w:r>
               <w:t xml:space="preserve">_pays</w:t>
             </w:r>
-            <w:r/>
             <w:r/>
           </w:p>
         </w:tc>
@@ -6663,7 +6616,6 @@
               <w:t xml:space="preserve">Pays du bailleur</w:t>
             </w:r>
             <w:r/>
-            <w:r/>
           </w:p>
         </w:tc>
         <w:tc>
@@ -6682,7 +6634,6 @@
               <w:t xml:space="preserve">VARCHAR</w:t>
             </w:r>
             <w:r/>
-            <w:r/>
           </w:p>
         </w:tc>
         <w:tc>
@@ -6700,7 +6651,6 @@
             <w:r>
               <w:t xml:space="preserve">50</w:t>
             </w:r>
-            <w:r/>
             <w:r/>
           </w:p>
         </w:tc>
@@ -6719,18 +6669,15 @@
               <w:ind/>
               <w:rPr/>
             </w:pPr>
-            <w:r/>
             <w:r>
               <w:t xml:space="preserve">bailleur</w:t>
             </w:r>
             <w:r>
               <w:t xml:space="preserve">_</w:t>
             </w:r>
-            <w:r/>
             <w:r>
               <w:t xml:space="preserve">contact</w:t>
             </w:r>
-            <w:r/>
             <w:r/>
           </w:p>
         </w:tc>
@@ -6750,7 +6697,6 @@
               <w:t xml:space="preserve">Personne de contact</w:t>
             </w:r>
             <w:r/>
-            <w:r/>
           </w:p>
         </w:tc>
         <w:tc>
@@ -6769,7 +6715,6 @@
               <w:t xml:space="preserve">VARCHAR</w:t>
             </w:r>
             <w:r/>
-            <w:r/>
           </w:p>
         </w:tc>
         <w:tc>
@@ -6787,7 +6732,6 @@
             <w:r>
               <w:t xml:space="preserve">100</w:t>
             </w:r>
-            <w:r/>
             <w:r/>
           </w:p>
         </w:tc>
@@ -6806,18 +6750,15 @@
               <w:ind/>
               <w:rPr/>
             </w:pPr>
-            <w:r/>
             <w:r>
               <w:t xml:space="preserve">bailleur</w:t>
             </w:r>
             <w:r>
               <w:t xml:space="preserve">_</w:t>
             </w:r>
-            <w:r/>
             <w:r>
               <w:t xml:space="preserve">email</w:t>
             </w:r>
-            <w:r/>
             <w:r/>
           </w:p>
         </w:tc>
@@ -6837,7 +6778,6 @@
               <w:t xml:space="preserve">Adresse électronique</w:t>
             </w:r>
             <w:r/>
-            <w:r/>
           </w:p>
         </w:tc>
         <w:tc>
@@ -6856,7 +6796,6 @@
               <w:t xml:space="preserve">VARCHAR</w:t>
             </w:r>
             <w:r/>
-            <w:r/>
           </w:p>
         </w:tc>
         <w:tc>
@@ -6874,7 +6813,6 @@
             <w:r>
               <w:t xml:space="preserve">100</w:t>
             </w:r>
-            <w:r/>
             <w:r/>
           </w:p>
         </w:tc>
@@ -6893,18 +6831,15 @@
               <w:ind/>
               <w:rPr/>
             </w:pPr>
-            <w:r/>
             <w:r>
               <w:t xml:space="preserve">bailleur</w:t>
             </w:r>
             <w:r>
               <w:t xml:space="preserve">_</w:t>
             </w:r>
-            <w:r/>
             <w:r>
               <w:t xml:space="preserve">telephone</w:t>
             </w:r>
-            <w:r/>
             <w:r/>
           </w:p>
         </w:tc>
@@ -6924,7 +6859,6 @@
               <w:t xml:space="preserve">Numéro de téléphone</w:t>
             </w:r>
             <w:r/>
-            <w:r/>
           </w:p>
         </w:tc>
         <w:tc>
@@ -6943,7 +6877,6 @@
               <w:t xml:space="preserve">VARCHAR</w:t>
             </w:r>
             <w:r/>
-            <w:r/>
           </w:p>
         </w:tc>
         <w:tc>
@@ -6961,7 +6894,6 @@
             <w:r>
               <w:t xml:space="preserve">20</w:t>
             </w:r>
-            <w:r/>
             <w:r/>
           </w:p>
         </w:tc>
@@ -6980,18 +6912,15 @@
               <w:ind/>
               <w:rPr/>
             </w:pPr>
-            <w:r/>
             <w:r>
               <w:t xml:space="preserve">bailleur</w:t>
             </w:r>
             <w:r>
               <w:t xml:space="preserve">_</w:t>
             </w:r>
-            <w:r/>
             <w:r>
               <w:t xml:space="preserve">adresse</w:t>
             </w:r>
-            <w:r/>
             <w:r/>
           </w:p>
         </w:tc>
@@ -7011,7 +6940,6 @@
               <w:t xml:space="preserve">Adresse du bailleur</w:t>
             </w:r>
             <w:r/>
-            <w:r/>
           </w:p>
         </w:tc>
         <w:tc>
@@ -7030,7 +6958,6 @@
               <w:t xml:space="preserve">VARCHAR</w:t>
             </w:r>
             <w:r/>
-            <w:r/>
           </w:p>
         </w:tc>
         <w:tc>
@@ -7048,7 +6975,6 @@
             <w:r>
               <w:t xml:space="preserve">150</w:t>
             </w:r>
-            <w:r/>
             <w:r/>
           </w:p>
         </w:tc>
@@ -7067,18 +6993,15 @@
               <w:ind/>
               <w:rPr/>
             </w:pPr>
-            <w:r/>
             <w:r>
               <w:t xml:space="preserve">bailleur</w:t>
             </w:r>
             <w:r>
               <w:t xml:space="preserve">_</w:t>
             </w:r>
-            <w:r/>
             <w:r>
               <w:t xml:space="preserve">description</w:t>
             </w:r>
-            <w:r/>
             <w:r/>
           </w:p>
         </w:tc>
@@ -7098,7 +7021,6 @@
               <w:t xml:space="preserve">Description du bailleur</w:t>
             </w:r>
             <w:r/>
-            <w:r/>
           </w:p>
         </w:tc>
         <w:tc>
@@ -7117,7 +7039,6 @@
               <w:t xml:space="preserve">TEXT</w:t>
             </w:r>
             <w:r/>
-            <w:r/>
           </w:p>
         </w:tc>
         <w:tc>
@@ -7135,7 +7056,6 @@
             <w:r>
               <w:t xml:space="preserve">-</w:t>
             </w:r>
-            <w:r/>
             <w:r/>
           </w:p>
         </w:tc>
@@ -7148,13 +7068,11 @@
         <w:ind/>
         <w:rPr/>
       </w:pPr>
-      <w:r/>
       <w:r/>
       <w:r/>
     </w:p>
     <w:p>
       <w:pPr>
-        <w:pStyle w:val="838"/>
         <w:pBdr/>
         <w:spacing/>
         <w:ind/>
@@ -7163,7 +7081,6 @@
       <w:r>
         <w:t xml:space="preserve">Classe Convention</w:t>
       </w:r>
-      <w:r/>
       <w:r/>
     </w:p>
     <w:tbl>
@@ -7197,7 +7114,6 @@
               <w:t xml:space="preserve">Nom</w:t>
             </w:r>
             <w:r/>
-            <w:r/>
           </w:p>
         </w:tc>
         <w:tc>
@@ -7216,7 +7132,6 @@
               <w:t xml:space="preserve">Désignation</w:t>
             </w:r>
             <w:r/>
-            <w:r/>
           </w:p>
         </w:tc>
         <w:tc>
@@ -7235,7 +7150,6 @@
               <w:t xml:space="preserve">Type SQL</w:t>
             </w:r>
             <w:r/>
-            <w:r/>
           </w:p>
         </w:tc>
         <w:tc>
@@ -7253,7 +7167,6 @@
             <w:r>
               <w:t xml:space="preserve">Taille</w:t>
             </w:r>
-            <w:r/>
             <w:r/>
           </w:p>
         </w:tc>
@@ -7276,7 +7189,6 @@
               <w:t xml:space="preserve">id_convention</w:t>
             </w:r>
             <w:r/>
-            <w:r/>
           </w:p>
         </w:tc>
         <w:tc>
@@ -7295,7 +7207,6 @@
               <w:t xml:space="preserve">Identifiant de la convention</w:t>
             </w:r>
             <w:r/>
-            <w:r/>
           </w:p>
         </w:tc>
         <w:tc>
@@ -7314,7 +7225,6 @@
               <w:t xml:space="preserve">INT</w:t>
             </w:r>
             <w:r/>
-            <w:r/>
           </w:p>
         </w:tc>
         <w:tc>
@@ -7332,7 +7242,6 @@
             <w:r>
               <w:t xml:space="preserve">20</w:t>
             </w:r>
-            <w:r/>
             <w:r/>
           </w:p>
         </w:tc>
@@ -7355,7 +7264,6 @@
               <w:t xml:space="preserve">convention_titre</w:t>
             </w:r>
             <w:r/>
-            <w:r/>
           </w:p>
         </w:tc>
         <w:tc>
@@ -7374,7 +7282,6 @@
               <w:t xml:space="preserve">Titre de la convention</w:t>
             </w:r>
             <w:r/>
-            <w:r/>
           </w:p>
         </w:tc>
         <w:tc>
@@ -7393,7 +7300,6 @@
               <w:t xml:space="preserve">VARCHAR</w:t>
             </w:r>
             <w:r/>
-            <w:r/>
           </w:p>
         </w:tc>
         <w:tc>
@@ -7411,7 +7317,6 @@
             <w:r>
               <w:t xml:space="preserve">150</w:t>
             </w:r>
-            <w:r/>
             <w:r/>
           </w:p>
         </w:tc>
@@ -7430,15 +7335,12 @@
               <w:ind/>
               <w:rPr/>
             </w:pPr>
-            <w:r/>
             <w:r>
               <w:t xml:space="preserve">convention_</w:t>
             </w:r>
-            <w:r/>
             <w:r>
               <w:t xml:space="preserve">description</w:t>
             </w:r>
-            <w:r/>
             <w:r/>
           </w:p>
         </w:tc>
@@ -7458,7 +7360,6 @@
               <w:t xml:space="preserve">Description de la convention</w:t>
             </w:r>
             <w:r/>
-            <w:r/>
           </w:p>
         </w:tc>
         <w:tc>
@@ -7477,7 +7378,6 @@
               <w:t xml:space="preserve">TEXT</w:t>
             </w:r>
             <w:r/>
-            <w:r/>
           </w:p>
         </w:tc>
         <w:tc>
@@ -7495,7 +7395,6 @@
             <w:r>
               <w:t xml:space="preserve">-</w:t>
             </w:r>
-            <w:r/>
             <w:r/>
           </w:p>
         </w:tc>
@@ -7514,15 +7413,12 @@
               <w:ind/>
               <w:rPr/>
             </w:pPr>
-            <w:r/>
             <w:r>
               <w:t xml:space="preserve">convention_</w:t>
             </w:r>
-            <w:r/>
             <w:r>
               <w:t xml:space="preserve">montant</w:t>
             </w:r>
-            <w:r/>
             <w:r/>
           </w:p>
         </w:tc>
@@ -7542,7 +7438,6 @@
               <w:t xml:space="preserve">Montant de la convention</w:t>
             </w:r>
             <w:r/>
-            <w:r/>
           </w:p>
         </w:tc>
         <w:tc>
@@ -7561,7 +7456,6 @@
               <w:t xml:space="preserve">DECIMAL</w:t>
             </w:r>
             <w:r/>
-            <w:r/>
           </w:p>
         </w:tc>
         <w:tc>
@@ -7579,7 +7473,6 @@
             <w:r>
               <w:t xml:space="preserve">15,2</w:t>
             </w:r>
-            <w:r/>
             <w:r/>
           </w:p>
         </w:tc>
@@ -7598,15 +7491,12 @@
               <w:ind/>
               <w:rPr/>
             </w:pPr>
-            <w:r/>
             <w:r>
               <w:t xml:space="preserve">convention_</w:t>
             </w:r>
-            <w:r/>
             <w:r>
               <w:t xml:space="preserve">forme</w:t>
             </w:r>
-            <w:r/>
             <w:r/>
           </w:p>
         </w:tc>
@@ -7626,7 +7516,6 @@
               <w:t xml:space="preserve">Forme de financement</w:t>
             </w:r>
             <w:r/>
-            <w:r/>
           </w:p>
         </w:tc>
         <w:tc>
@@ -7645,7 +7534,6 @@
               <w:t xml:space="preserve">ENUM(pret, don)</w:t>
             </w:r>
             <w:r/>
-            <w:r/>
           </w:p>
         </w:tc>
         <w:tc>
@@ -7663,7 +7551,6 @@
             <w:r>
               <w:t xml:space="preserve">-</w:t>
             </w:r>
-            <w:r/>
             <w:r/>
           </w:p>
         </w:tc>
@@ -7682,15 +7569,12 @@
               <w:ind/>
               <w:rPr/>
             </w:pPr>
-            <w:r/>
             <w:r>
               <w:t xml:space="preserve">convention_</w:t>
             </w:r>
-            <w:r/>
             <w:r>
               <w:t xml:space="preserve">devise</w:t>
             </w:r>
-            <w:r/>
             <w:r/>
           </w:p>
         </w:tc>
@@ -7710,7 +7594,6 @@
               <w:t xml:space="preserve">Devise utilisée</w:t>
             </w:r>
             <w:r/>
-            <w:r/>
           </w:p>
         </w:tc>
         <w:tc>
@@ -7729,7 +7612,6 @@
               <w:t xml:space="preserve">VARCHAR</w:t>
             </w:r>
             <w:r/>
-            <w:r/>
           </w:p>
         </w:tc>
         <w:tc>
@@ -7747,7 +7629,6 @@
             <w:r>
               <w:t xml:space="preserve">10</w:t>
             </w:r>
-            <w:r/>
             <w:r/>
           </w:p>
         </w:tc>
@@ -7766,15 +7647,12 @@
               <w:ind/>
               <w:rPr/>
             </w:pPr>
-            <w:r/>
             <w:r>
               <w:t xml:space="preserve">convention_</w:t>
             </w:r>
-            <w:r/>
             <w:r>
               <w:t xml:space="preserve">taux_conversion</w:t>
             </w:r>
-            <w:r/>
             <w:r/>
           </w:p>
         </w:tc>
@@ -7794,7 +7672,6 @@
               <w:t xml:space="preserve">Taux de conversion</w:t>
             </w:r>
             <w:r/>
-            <w:r/>
           </w:p>
         </w:tc>
         <w:tc>
@@ -7813,7 +7690,6 @@
               <w:t xml:space="preserve">DECIMAL</w:t>
             </w:r>
             <w:r/>
-            <w:r/>
           </w:p>
         </w:tc>
         <w:tc>
@@ -7831,7 +7707,6 @@
             <w:r>
               <w:t xml:space="preserve">10,2</w:t>
             </w:r>
-            <w:r/>
             <w:r/>
           </w:p>
         </w:tc>
@@ -7850,15 +7725,12 @@
               <w:ind/>
               <w:rPr/>
             </w:pPr>
-            <w:r/>
             <w:r>
               <w:t xml:space="preserve">convention_</w:t>
             </w:r>
-            <w:r/>
             <w:r>
               <w:t xml:space="preserve">statut</w:t>
             </w:r>
-            <w:r/>
             <w:r/>
           </w:p>
         </w:tc>
@@ -7878,7 +7750,6 @@
               <w:t xml:space="preserve">Statut de la convention</w:t>
             </w:r>
             <w:r/>
-            <w:r/>
           </w:p>
         </w:tc>
         <w:tc>
@@ -7897,7 +7768,6 @@
               <w:t xml:space="preserve">ENUM(active, suspendue, terminee, annulee)</w:t>
             </w:r>
             <w:r/>
-            <w:r/>
           </w:p>
         </w:tc>
         <w:tc>
@@ -7915,7 +7785,6 @@
             <w:r>
               <w:t xml:space="preserve">-</w:t>
             </w:r>
-            <w:r/>
             <w:r/>
           </w:p>
         </w:tc>
@@ -7934,15 +7803,12 @@
               <w:ind/>
               <w:rPr/>
             </w:pPr>
-            <w:r/>
             <w:r>
               <w:t xml:space="preserve">convention_</w:t>
             </w:r>
-            <w:r/>
             <w:r>
               <w:t xml:space="preserve">date_signature</w:t>
             </w:r>
-            <w:r/>
             <w:r/>
           </w:p>
         </w:tc>
@@ -7962,7 +7828,6 @@
               <w:t xml:space="preserve">Date de signature</w:t>
             </w:r>
             <w:r/>
-            <w:r/>
           </w:p>
         </w:tc>
         <w:tc>
@@ -7981,7 +7846,6 @@
               <w:t xml:space="preserve">DATE</w:t>
             </w:r>
             <w:r/>
-            <w:r/>
           </w:p>
         </w:tc>
         <w:tc>
@@ -7999,7 +7863,6 @@
             <w:r>
               <w:t xml:space="preserve">-</w:t>
             </w:r>
-            <w:r/>
             <w:r/>
           </w:p>
         </w:tc>
@@ -8018,15 +7881,12 @@
               <w:ind/>
               <w:rPr/>
             </w:pPr>
-            <w:r/>
             <w:r>
               <w:t xml:space="preserve">convention_</w:t>
             </w:r>
-            <w:r/>
             <w:r>
               <w:t xml:space="preserve">date_debut</w:t>
             </w:r>
-            <w:r/>
             <w:r/>
           </w:p>
         </w:tc>
@@ -8046,7 +7906,6 @@
               <w:t xml:space="preserve">Date de début</w:t>
             </w:r>
             <w:r/>
-            <w:r/>
           </w:p>
         </w:tc>
         <w:tc>
@@ -8065,7 +7924,6 @@
               <w:t xml:space="preserve">DATE</w:t>
             </w:r>
             <w:r/>
-            <w:r/>
           </w:p>
         </w:tc>
         <w:tc>
@@ -8083,7 +7941,6 @@
             <w:r>
               <w:t xml:space="preserve">-</w:t>
             </w:r>
-            <w:r/>
             <w:r/>
           </w:p>
         </w:tc>
@@ -8102,15 +7959,12 @@
               <w:ind/>
               <w:rPr/>
             </w:pPr>
-            <w:r/>
             <w:r>
               <w:t xml:space="preserve">convention_</w:t>
             </w:r>
-            <w:r/>
             <w:r>
               <w:t xml:space="preserve">date_fin</w:t>
             </w:r>
-            <w:r/>
             <w:r/>
           </w:p>
         </w:tc>
@@ -8130,7 +7984,6 @@
               <w:t xml:space="preserve">Date de fin</w:t>
             </w:r>
             <w:r/>
-            <w:r/>
           </w:p>
         </w:tc>
         <w:tc>
@@ -8149,7 +8002,6 @@
               <w:t xml:space="preserve">DATE</w:t>
             </w:r>
             <w:r/>
-            <w:r/>
           </w:p>
         </w:tc>
         <w:tc>
@@ -8167,7 +8019,6 @@
             <w:r>
               <w:t xml:space="preserve">-</w:t>
             </w:r>
-            <w:r/>
             <w:r/>
           </w:p>
         </w:tc>
@@ -8180,13 +8031,11 @@
         <w:ind/>
         <w:rPr/>
       </w:pPr>
-      <w:r/>
       <w:r/>
       <w:r/>
     </w:p>
     <w:p>
       <w:pPr>
-        <w:pStyle w:val="838"/>
         <w:pBdr/>
         <w:spacing/>
         <w:ind/>
@@ -8195,7 +8044,6 @@
       <w:r>
         <w:t xml:space="preserve">Classe Rubrique</w:t>
       </w:r>
-      <w:r/>
       <w:r/>
     </w:p>
     <w:tbl>
@@ -8229,7 +8077,6 @@
               <w:t xml:space="preserve">Nom</w:t>
             </w:r>
             <w:r/>
-            <w:r/>
           </w:p>
         </w:tc>
         <w:tc>
@@ -8248,7 +8095,6 @@
               <w:t xml:space="preserve">Désignation</w:t>
             </w:r>
             <w:r/>
-            <w:r/>
           </w:p>
         </w:tc>
         <w:tc>
@@ -8267,7 +8113,6 @@
               <w:t xml:space="preserve">Type SQL</w:t>
             </w:r>
             <w:r/>
-            <w:r/>
           </w:p>
         </w:tc>
         <w:tc>
@@ -8285,7 +8130,6 @@
             <w:r>
               <w:t xml:space="preserve">Taille</w:t>
             </w:r>
-            <w:r/>
             <w:r/>
           </w:p>
         </w:tc>
@@ -8308,7 +8152,6 @@
               <w:t xml:space="preserve">id_rubrique</w:t>
             </w:r>
             <w:r/>
-            <w:r/>
           </w:p>
         </w:tc>
         <w:tc>
@@ -8327,7 +8170,6 @@
               <w:t xml:space="preserve">Identifiant de la rubrique</w:t>
             </w:r>
             <w:r/>
-            <w:r/>
           </w:p>
         </w:tc>
         <w:tc>
@@ -8346,7 +8188,6 @@
               <w:t xml:space="preserve">INT</w:t>
             </w:r>
             <w:r/>
-            <w:r/>
           </w:p>
         </w:tc>
         <w:tc>
@@ -8364,7 +8205,6 @@
             <w:r>
               <w:t xml:space="preserve">20</w:t>
             </w:r>
-            <w:r/>
             <w:r/>
           </w:p>
         </w:tc>
@@ -8383,15 +8223,12 @@
               <w:ind/>
               <w:rPr/>
             </w:pPr>
-            <w:r/>
             <w:r>
               <w:t xml:space="preserve">rubrique_</w:t>
             </w:r>
-            <w:r/>
             <w:r>
               <w:t xml:space="preserve">libelle</w:t>
             </w:r>
-            <w:r/>
             <w:r/>
           </w:p>
         </w:tc>
@@ -8411,7 +8248,6 @@
               <w:t xml:space="preserve">Libellé de la rubrique</w:t>
             </w:r>
             <w:r/>
-            <w:r/>
           </w:p>
         </w:tc>
         <w:tc>
@@ -8430,7 +8266,6 @@
               <w:t xml:space="preserve">VARCHAR</w:t>
             </w:r>
             <w:r/>
-            <w:r/>
           </w:p>
         </w:tc>
         <w:tc>
@@ -8448,7 +8283,6 @@
             <w:r>
               <w:t xml:space="preserve">100</w:t>
             </w:r>
-            <w:r/>
             <w:r/>
           </w:p>
         </w:tc>
@@ -8467,15 +8301,12 @@
               <w:ind/>
               <w:rPr/>
             </w:pPr>
-            <w:r/>
             <w:r>
               <w:t xml:space="preserve">rubrique_</w:t>
             </w:r>
-            <w:r/>
             <w:r>
               <w:t xml:space="preserve">description</w:t>
             </w:r>
-            <w:r/>
             <w:r/>
           </w:p>
         </w:tc>
@@ -8495,7 +8326,6 @@
               <w:t xml:space="preserve">Description de la rubrique</w:t>
             </w:r>
             <w:r/>
-            <w:r/>
           </w:p>
         </w:tc>
         <w:tc>
@@ -8514,7 +8344,6 @@
               <w:t xml:space="preserve">TEXT</w:t>
             </w:r>
             <w:r/>
-            <w:r/>
           </w:p>
         </w:tc>
         <w:tc>
@@ -8532,7 +8361,6 @@
             <w:r>
               <w:t xml:space="preserve">-</w:t>
             </w:r>
-            <w:r/>
             <w:r/>
           </w:p>
         </w:tc>
@@ -8551,15 +8379,12 @@
               <w:ind/>
               <w:rPr/>
             </w:pPr>
-            <w:r/>
             <w:r>
               <w:t xml:space="preserve">rubrique_</w:t>
             </w:r>
-            <w:r/>
             <w:r>
               <w:t xml:space="preserve">budget_prevu</w:t>
             </w:r>
-            <w:r/>
             <w:r/>
           </w:p>
         </w:tc>
@@ -8579,7 +8404,6 @@
               <w:t xml:space="preserve">Budget prévu</w:t>
             </w:r>
             <w:r/>
-            <w:r/>
           </w:p>
         </w:tc>
         <w:tc>
@@ -8598,7 +8422,6 @@
               <w:t xml:space="preserve">DECIMAL</w:t>
             </w:r>
             <w:r/>
-            <w:r/>
           </w:p>
         </w:tc>
         <w:tc>
@@ -8616,91 +8439,6 @@
             <w:r>
               <w:t xml:space="preserve">15,2</w:t>
             </w:r>
-            <w:r/>
-            <w:r/>
-          </w:p>
-        </w:tc>
-      </w:tr>
-      <w:tr>
-        <w:trPr/>
-        <w:tc>
-          <w:tcPr>
-            <w:tcBorders/>
-            <w:tcW w:w="2160" w:type="dxa"/>
-          </w:tcPr>
-          <w:p>
-            <w:pPr>
-              <w:pBdr/>
-              <w:spacing/>
-              <w:ind/>
-              <w:rPr/>
-            </w:pPr>
-            <w:r/>
-            <w:r>
-              <w:t xml:space="preserve">rubrique_</w:t>
-            </w:r>
-            <w:r/>
-            <w:r>
-              <w:t xml:space="preserve">budget_consomme</w:t>
-            </w:r>
-            <w:r/>
-            <w:r/>
-          </w:p>
-        </w:tc>
-        <w:tc>
-          <w:tcPr>
-            <w:tcBorders/>
-            <w:tcW w:w="2160" w:type="dxa"/>
-          </w:tcPr>
-          <w:p>
-            <w:pPr>
-              <w:pBdr/>
-              <w:spacing/>
-              <w:ind/>
-              <w:rPr/>
-            </w:pPr>
-            <w:r>
-              <w:t xml:space="preserve">Budget consommé</w:t>
-            </w:r>
-            <w:r/>
-            <w:r/>
-          </w:p>
-        </w:tc>
-        <w:tc>
-          <w:tcPr>
-            <w:tcBorders/>
-            <w:tcW w:w="2160" w:type="dxa"/>
-          </w:tcPr>
-          <w:p>
-            <w:pPr>
-              <w:pBdr/>
-              <w:spacing/>
-              <w:ind/>
-              <w:rPr/>
-            </w:pPr>
-            <w:r>
-              <w:t xml:space="preserve">DECIMAL</w:t>
-            </w:r>
-            <w:r/>
-            <w:r/>
-          </w:p>
-        </w:tc>
-        <w:tc>
-          <w:tcPr>
-            <w:tcBorders/>
-            <w:tcW w:w="2160" w:type="dxa"/>
-          </w:tcPr>
-          <w:p>
-            <w:pPr>
-              <w:pBdr/>
-              <w:spacing/>
-              <w:ind/>
-              <w:rPr/>
-            </w:pPr>
-            <w:r>
-              <w:t xml:space="preserve">15,2</w:t>
-            </w:r>
-            <w:r/>
             <w:r/>
           </w:p>
         </w:tc>
@@ -8713,13 +8451,11 @@
         <w:ind/>
         <w:rPr/>
       </w:pPr>
-      <w:r/>
       <w:r/>
       <w:r/>
     </w:p>
     <w:p>
       <w:pPr>
-        <w:pStyle w:val="838"/>
         <w:pBdr/>
         <w:spacing/>
         <w:ind/>
@@ -8728,7 +8464,6 @@
       <w:r>
         <w:t xml:space="preserve">Classe Versement</w:t>
       </w:r>
-      <w:r/>
       <w:r/>
     </w:p>
     <w:tbl>
@@ -8762,7 +8497,6 @@
               <w:t xml:space="preserve">Nom</w:t>
             </w:r>
             <w:r/>
-            <w:r/>
           </w:p>
         </w:tc>
         <w:tc>
@@ -8781,7 +8515,6 @@
               <w:t xml:space="preserve">Désignation</w:t>
             </w:r>
             <w:r/>
-            <w:r/>
           </w:p>
         </w:tc>
         <w:tc>
@@ -8800,7 +8533,6 @@
               <w:t xml:space="preserve">Type SQL</w:t>
             </w:r>
             <w:r/>
-            <w:r/>
           </w:p>
         </w:tc>
         <w:tc>
@@ -8818,7 +8550,6 @@
             <w:r>
               <w:t xml:space="preserve">Taille</w:t>
             </w:r>
-            <w:r/>
             <w:r/>
           </w:p>
         </w:tc>
@@ -8841,7 +8572,6 @@
               <w:t xml:space="preserve">id_versement</w:t>
             </w:r>
             <w:r/>
-            <w:r/>
           </w:p>
         </w:tc>
         <w:tc>
@@ -8860,7 +8590,6 @@
               <w:t xml:space="preserve">Identifiant du versement</w:t>
             </w:r>
             <w:r/>
-            <w:r/>
           </w:p>
         </w:tc>
         <w:tc>
@@ -8879,7 +8608,6 @@
               <w:t xml:space="preserve">INT</w:t>
             </w:r>
             <w:r/>
-            <w:r/>
           </w:p>
         </w:tc>
         <w:tc>
@@ -8897,7 +8625,6 @@
             <w:r>
               <w:t xml:space="preserve">20</w:t>
             </w:r>
-            <w:r/>
             <w:r/>
           </w:p>
         </w:tc>
@@ -8916,14 +8643,12 @@
               <w:ind/>
               <w:rPr/>
             </w:pPr>
-            <w:r/>
             <w:r>
               <w:t xml:space="preserve">versement_</w:t>
             </w:r>
             <w:r>
               <w:t xml:space="preserve">montant</w:t>
             </w:r>
-            <w:r/>
             <w:r/>
           </w:p>
         </w:tc>
@@ -8943,7 +8668,6 @@
               <w:t xml:space="preserve">Montant versé</w:t>
             </w:r>
             <w:r/>
-            <w:r/>
           </w:p>
         </w:tc>
         <w:tc>
@@ -8962,7 +8686,6 @@
               <w:t xml:space="preserve">DECIMAL</w:t>
             </w:r>
             <w:r/>
-            <w:r/>
           </w:p>
         </w:tc>
         <w:tc>
@@ -8980,7 +8703,6 @@
             <w:r>
               <w:t xml:space="preserve">15,2</w:t>
             </w:r>
-            <w:r/>
             <w:r/>
           </w:p>
         </w:tc>
@@ -8999,14 +8721,12 @@
               <w:ind/>
               <w:rPr/>
             </w:pPr>
-            <w:r/>
             <w:r>
               <w:t xml:space="preserve">versement_</w:t>
             </w:r>
             <w:r>
               <w:t xml:space="preserve">date_reception</w:t>
             </w:r>
-            <w:r/>
             <w:r/>
           </w:p>
         </w:tc>
@@ -9026,7 +8746,6 @@
               <w:t xml:space="preserve">Date du versement</w:t>
             </w:r>
             <w:r/>
-            <w:r/>
           </w:p>
         </w:tc>
         <w:tc>
@@ -9045,7 +8764,6 @@
               <w:t xml:space="preserve">DATE</w:t>
             </w:r>
             <w:r/>
-            <w:r/>
           </w:p>
         </w:tc>
         <w:tc>
@@ -9063,7 +8781,6 @@
             <w:r>
               <w:t xml:space="preserve">-</w:t>
             </w:r>
-            <w:r/>
             <w:r/>
           </w:p>
         </w:tc>
@@ -9082,15 +8799,12 @@
               <w:ind/>
               <w:rPr/>
             </w:pPr>
-            <w:r/>
             <w:r>
               <w:t xml:space="preserve">versement_</w:t>
             </w:r>
-            <w:r/>
             <w:r>
               <w:t xml:space="preserve">reference</w:t>
             </w:r>
-            <w:r/>
             <w:r/>
           </w:p>
         </w:tc>
@@ -9110,7 +8824,6 @@
               <w:t xml:space="preserve">Référence du versement</w:t>
             </w:r>
             <w:r/>
-            <w:r/>
           </w:p>
         </w:tc>
         <w:tc>
@@ -9129,7 +8842,6 @@
               <w:t xml:space="preserve">VARCHAR</w:t>
             </w:r>
             <w:r/>
-            <w:r/>
           </w:p>
         </w:tc>
         <w:tc>
@@ -9147,7 +8859,6 @@
             <w:r>
               <w:t xml:space="preserve">100</w:t>
             </w:r>
-            <w:r/>
             <w:r/>
           </w:p>
         </w:tc>
@@ -9166,15 +8877,12 @@
               <w:ind/>
               <w:rPr/>
             </w:pPr>
-            <w:r/>
             <w:r>
               <w:t xml:space="preserve">versement_</w:t>
             </w:r>
-            <w:r/>
             <w:r>
               <w:t xml:space="preserve">description</w:t>
             </w:r>
-            <w:r/>
             <w:r/>
           </w:p>
         </w:tc>
@@ -9194,7 +8902,6 @@
               <w:t xml:space="preserve">Description du versement</w:t>
             </w:r>
             <w:r/>
-            <w:r/>
           </w:p>
         </w:tc>
         <w:tc>
@@ -9213,7 +8920,6 @@
               <w:t xml:space="preserve">TEXT</w:t>
             </w:r>
             <w:r/>
-            <w:r/>
           </w:p>
         </w:tc>
         <w:tc>
@@ -9231,7 +8937,6 @@
             <w:r>
               <w:t xml:space="preserve">-</w:t>
             </w:r>
-            <w:r/>
             <w:r/>
           </w:p>
         </w:tc>
@@ -9244,13 +8949,11 @@
         <w:ind/>
         <w:rPr/>
       </w:pPr>
-      <w:r/>
       <w:r/>
       <w:r/>
     </w:p>
     <w:p>
       <w:pPr>
-        <w:pStyle w:val="838"/>
         <w:pBdr/>
         <w:spacing/>
         <w:ind/>
@@ -9259,7 +8962,6 @@
       <w:r>
         <w:t xml:space="preserve">Classe Demande_depense</w:t>
       </w:r>
-      <w:r/>
       <w:r/>
     </w:p>
     <w:tbl>
@@ -9293,7 +8995,6 @@
               <w:t xml:space="preserve">Nom</w:t>
             </w:r>
             <w:r/>
-            <w:r/>
           </w:p>
         </w:tc>
         <w:tc>
@@ -9312,7 +9013,6 @@
               <w:t xml:space="preserve">Désignation</w:t>
             </w:r>
             <w:r/>
-            <w:r/>
           </w:p>
         </w:tc>
         <w:tc>
@@ -9331,7 +9031,6 @@
               <w:t xml:space="preserve">Type SQL</w:t>
             </w:r>
             <w:r/>
-            <w:r/>
           </w:p>
         </w:tc>
         <w:tc>
@@ -9349,7 +9048,6 @@
             <w:r>
               <w:t xml:space="preserve">Taille</w:t>
             </w:r>
-            <w:r/>
             <w:r/>
           </w:p>
         </w:tc>
@@ -9372,7 +9070,6 @@
               <w:t xml:space="preserve">id_demande</w:t>
             </w:r>
             <w:r/>
-            <w:r/>
           </w:p>
         </w:tc>
         <w:tc>
@@ -9391,7 +9088,6 @@
               <w:t xml:space="preserve">Identifiant de la demande</w:t>
             </w:r>
             <w:r/>
-            <w:r/>
           </w:p>
         </w:tc>
         <w:tc>
@@ -9410,7 +9106,6 @@
               <w:t xml:space="preserve">INT</w:t>
             </w:r>
             <w:r/>
-            <w:r/>
           </w:p>
         </w:tc>
         <w:tc>
@@ -9428,7 +9123,6 @@
             <w:r>
               <w:t xml:space="preserve">20</w:t>
             </w:r>
-            <w:r/>
             <w:r/>
           </w:p>
         </w:tc>
@@ -9447,15 +9141,12 @@
               <w:ind/>
               <w:rPr/>
             </w:pPr>
-            <w:r/>
             <w:r>
               <w:t xml:space="preserve">demande_</w:t>
             </w:r>
-            <w:r/>
             <w:r>
               <w:t xml:space="preserve">montant</w:t>
             </w:r>
-            <w:r/>
             <w:r/>
           </w:p>
         </w:tc>
@@ -9475,7 +9166,6 @@
               <w:t xml:space="preserve">Montant demandé</w:t>
             </w:r>
             <w:r/>
-            <w:r/>
           </w:p>
         </w:tc>
         <w:tc>
@@ -9494,7 +9184,6 @@
               <w:t xml:space="preserve">DECIMAL</w:t>
             </w:r>
             <w:r/>
-            <w:r/>
           </w:p>
         </w:tc>
         <w:tc>
@@ -9512,7 +9201,6 @@
             <w:r>
               <w:t xml:space="preserve">15,2</w:t>
             </w:r>
-            <w:r/>
             <w:r/>
           </w:p>
         </w:tc>
@@ -9531,14 +9219,12 @@
               <w:ind/>
               <w:rPr/>
             </w:pPr>
-            <w:r/>
             <w:r>
               <w:t xml:space="preserve">demande_</w:t>
             </w:r>
             <w:r>
               <w:t xml:space="preserve">objet</w:t>
             </w:r>
-            <w:r/>
             <w:r/>
           </w:p>
         </w:tc>
@@ -9558,7 +9244,6 @@
               <w:t xml:space="preserve">Objet de la demande</w:t>
             </w:r>
             <w:r/>
-            <w:r/>
           </w:p>
         </w:tc>
         <w:tc>
@@ -9577,7 +9262,6 @@
               <w:t xml:space="preserve">VARCHAR</w:t>
             </w:r>
             <w:r/>
-            <w:r/>
           </w:p>
         </w:tc>
         <w:tc>
@@ -9595,7 +9279,6 @@
             <w:r>
               <w:t xml:space="preserve">150</w:t>
             </w:r>
-            <w:r/>
             <w:r/>
           </w:p>
         </w:tc>
@@ -9614,15 +9297,12 @@
               <w:ind/>
               <w:rPr/>
             </w:pPr>
-            <w:r/>
             <w:r>
               <w:t xml:space="preserve">demande_</w:t>
             </w:r>
-            <w:r/>
             <w:r>
               <w:t xml:space="preserve">description</w:t>
             </w:r>
-            <w:r/>
             <w:r/>
           </w:p>
         </w:tc>
@@ -9642,7 +9322,6 @@
               <w:t xml:space="preserve">Description de la dépense</w:t>
             </w:r>
             <w:r/>
-            <w:r/>
           </w:p>
         </w:tc>
         <w:tc>
@@ -9661,7 +9340,6 @@
               <w:t xml:space="preserve">TEXT</w:t>
             </w:r>
             <w:r/>
-            <w:r/>
           </w:p>
         </w:tc>
         <w:tc>
@@ -9679,7 +9357,6 @@
             <w:r>
               <w:t xml:space="preserve">-</w:t>
             </w:r>
-            <w:r/>
             <w:r/>
           </w:p>
         </w:tc>
@@ -9698,15 +9375,12 @@
               <w:ind/>
               <w:rPr/>
             </w:pPr>
-            <w:r/>
             <w:r>
               <w:t xml:space="preserve">demande_</w:t>
             </w:r>
-            <w:r/>
             <w:r>
               <w:t xml:space="preserve">justificatif</w:t>
             </w:r>
-            <w:r/>
             <w:r/>
           </w:p>
         </w:tc>
@@ -9726,7 +9400,6 @@
               <w:t xml:space="preserve">Justificatif associé</w:t>
             </w:r>
             <w:r/>
-            <w:r/>
           </w:p>
         </w:tc>
         <w:tc>
@@ -9745,7 +9418,6 @@
               <w:t xml:space="preserve">VARCHAR</w:t>
             </w:r>
             <w:r/>
-            <w:r/>
           </w:p>
         </w:tc>
         <w:tc>
@@ -9763,7 +9435,6 @@
             <w:r>
               <w:t xml:space="preserve">255</w:t>
             </w:r>
-            <w:r/>
             <w:r/>
           </w:p>
         </w:tc>
@@ -9782,15 +9453,12 @@
               <w:ind/>
               <w:rPr/>
             </w:pPr>
-            <w:r/>
             <w:r>
               <w:t xml:space="preserve">demande_</w:t>
             </w:r>
-            <w:r/>
             <w:r>
               <w:t xml:space="preserve">statut</w:t>
             </w:r>
-            <w:r/>
             <w:r/>
           </w:p>
         </w:tc>
@@ -9810,7 +9478,6 @@
               <w:t xml:space="preserve">Statut de la demande</w:t>
             </w:r>
             <w:r/>
-            <w:r/>
           </w:p>
         </w:tc>
         <w:tc>
@@ -9829,7 +9496,6 @@
               <w:t xml:space="preserve">ENUM(soumise, validee_daf, rejetee_daf, validee_ac, rejetee_ac, payee, rapport_soumis, terminee)</w:t>
             </w:r>
             <w:r/>
-            <w:r/>
           </w:p>
         </w:tc>
         <w:tc>
@@ -9847,7 +9513,6 @@
             <w:r>
               <w:t xml:space="preserve">-</w:t>
             </w:r>
-            <w:r/>
             <w:r/>
           </w:p>
         </w:tc>
@@ -9866,15 +9531,12 @@
               <w:ind/>
               <w:rPr/>
             </w:pPr>
-            <w:r/>
             <w:r>
               <w:t xml:space="preserve">demande_</w:t>
             </w:r>
-            <w:r/>
             <w:r>
               <w:t xml:space="preserve">motif_rejet</w:t>
             </w:r>
-            <w:r/>
             <w:r/>
           </w:p>
         </w:tc>
@@ -9894,7 +9556,6 @@
               <w:t xml:space="preserve">Motif du rejet</w:t>
             </w:r>
             <w:r/>
-            <w:r/>
           </w:p>
         </w:tc>
         <w:tc>
@@ -9913,7 +9574,6 @@
               <w:t xml:space="preserve">TEXT</w:t>
             </w:r>
             <w:r/>
-            <w:r/>
           </w:p>
         </w:tc>
         <w:tc>
@@ -9931,7 +9591,6 @@
             <w:r>
               <w:t xml:space="preserve">-</w:t>
             </w:r>
-            <w:r/>
             <w:r/>
           </w:p>
         </w:tc>
@@ -9950,15 +9609,12 @@
               <w:ind/>
               <w:rPr/>
             </w:pPr>
-            <w:r/>
             <w:r>
               <w:t xml:space="preserve">demande_</w:t>
             </w:r>
-            <w:r/>
             <w:r>
               <w:t xml:space="preserve">rapport</w:t>
             </w:r>
-            <w:r/>
             <w:r/>
           </w:p>
         </w:tc>
@@ -9978,7 +9634,6 @@
               <w:t xml:space="preserve">Rapport d'exécution</w:t>
             </w:r>
             <w:r/>
-            <w:r/>
           </w:p>
         </w:tc>
         <w:tc>
@@ -9997,7 +9652,6 @@
               <w:t xml:space="preserve">VARCHAR</w:t>
             </w:r>
             <w:r/>
-            <w:r/>
           </w:p>
         </w:tc>
         <w:tc>
@@ -10015,7 +9669,6 @@
             <w:r>
               <w:t xml:space="preserve">255</w:t>
             </w:r>
-            <w:r/>
             <w:r/>
           </w:p>
         </w:tc>
@@ -10034,15 +9687,12 @@
               <w:ind/>
               <w:rPr/>
             </w:pPr>
-            <w:r/>
             <w:r>
               <w:t xml:space="preserve">demande_</w:t>
             </w:r>
-            <w:r/>
             <w:r>
               <w:t xml:space="preserve">date_validation_daf</w:t>
             </w:r>
-            <w:r/>
             <w:r/>
           </w:p>
         </w:tc>
@@ -10062,7 +9712,6 @@
               <w:t xml:space="preserve">Date de validation DAF</w:t>
             </w:r>
             <w:r/>
-            <w:r/>
           </w:p>
         </w:tc>
         <w:tc>
@@ -10081,7 +9730,6 @@
               <w:t xml:space="preserve">DATE</w:t>
             </w:r>
             <w:r/>
-            <w:r/>
           </w:p>
         </w:tc>
         <w:tc>
@@ -10099,7 +9747,6 @@
             <w:r>
               <w:t xml:space="preserve">-</w:t>
             </w:r>
-            <w:r/>
             <w:r/>
           </w:p>
         </w:tc>
@@ -10118,15 +9765,12 @@
               <w:ind/>
               <w:rPr/>
             </w:pPr>
-            <w:r/>
             <w:r>
               <w:t xml:space="preserve">demande_</w:t>
             </w:r>
-            <w:r/>
             <w:r>
               <w:t xml:space="preserve">date_validation_ac</w:t>
             </w:r>
-            <w:r/>
             <w:r/>
           </w:p>
         </w:tc>
@@ -10146,7 +9790,6 @@
               <w:t xml:space="preserve">Date de validation AC</w:t>
             </w:r>
             <w:r/>
-            <w:r/>
           </w:p>
         </w:tc>
         <w:tc>
@@ -10165,7 +9808,6 @@
               <w:t xml:space="preserve">DATE</w:t>
             </w:r>
             <w:r/>
-            <w:r/>
           </w:p>
         </w:tc>
         <w:tc>
@@ -10183,6 +9825,173 @@
             <w:r>
               <w:t xml:space="preserve">-</w:t>
             </w:r>
+            <w:r/>
+          </w:p>
+        </w:tc>
+      </w:tr>
+      <w:tr>
+        <w:trPr/>
+        <w:tc>
+          <w:tcPr>
+            <w:tcBorders/>
+            <w:tcW w:w="2160" w:type="dxa"/>
+            <w:vMerge w:val="restart"/>
+          </w:tcPr>
+          <w:p>
+            <w:pPr>
+              <w:pBdr/>
+              <w:spacing/>
+              <w:ind/>
+              <w:rPr/>
+            </w:pPr>
+            <w:r>
+              <w:t xml:space="preserve">rapport_</w:t>
+            </w:r>
+            <w:r>
+              <w:t xml:space="preserve">date_validation_daf</w:t>
+            </w:r>
+            <w:r/>
+            <w:r/>
+            <w:r/>
+            <w:r/>
+            <w:r/>
+          </w:p>
+        </w:tc>
+        <w:tc>
+          <w:tcPr>
+            <w:tcBorders/>
+            <w:tcW w:w="2160" w:type="dxa"/>
+            <w:vMerge w:val="restart"/>
+          </w:tcPr>
+          <w:p>
+            <w:pPr>
+              <w:pBdr/>
+              <w:spacing/>
+              <w:ind/>
+              <w:rPr/>
+            </w:pPr>
+            <w:r>
+              <w:t xml:space="preserve">Date de validation  du rapport par DAF</w:t>
+            </w:r>
+            <w:r/>
+            <w:r/>
+            <w:r/>
+          </w:p>
+        </w:tc>
+        <w:tc>
+          <w:tcPr>
+            <w:tcBorders/>
+            <w:tcW w:w="2160" w:type="dxa"/>
+            <w:vMerge w:val="restart"/>
+          </w:tcPr>
+          <w:p>
+            <w:pPr>
+              <w:pBdr/>
+              <w:spacing/>
+              <w:ind/>
+              <w:rPr/>
+            </w:pPr>
+            <w:r>
+              <w:t xml:space="preserve">DATE</w:t>
+            </w:r>
+            <w:r/>
+          </w:p>
+        </w:tc>
+        <w:tc>
+          <w:tcPr>
+            <w:tcBorders/>
+            <w:tcW w:w="2160" w:type="dxa"/>
+            <w:vMerge w:val="restart"/>
+          </w:tcPr>
+          <w:p>
+            <w:pPr>
+              <w:pBdr/>
+              <w:spacing/>
+              <w:ind/>
+              <w:rPr/>
+            </w:pPr>
+            <w:r/>
+            <w:r/>
+          </w:p>
+        </w:tc>
+      </w:tr>
+      <w:tr>
+        <w:trPr/>
+        <w:tc>
+          <w:tcPr>
+            <w:tcBorders/>
+            <w:tcW w:w="2160" w:type="dxa"/>
+            <w:vMerge w:val="restart"/>
+          </w:tcPr>
+          <w:p>
+            <w:pPr>
+              <w:pBdr/>
+              <w:spacing/>
+              <w:ind/>
+              <w:rPr/>
+            </w:pPr>
+            <w:r>
+              <w:t xml:space="preserve">rapport_</w:t>
+            </w:r>
+            <w:r>
+              <w:t xml:space="preserve">date_validation_ac</w:t>
+            </w:r>
+            <w:r/>
+            <w:r/>
+          </w:p>
+        </w:tc>
+        <w:tc>
+          <w:tcPr>
+            <w:tcBorders/>
+            <w:tcW w:w="2160" w:type="dxa"/>
+            <w:vMerge w:val="restart"/>
+          </w:tcPr>
+          <w:p>
+            <w:pPr>
+              <w:pBdr/>
+              <w:spacing/>
+              <w:ind/>
+              <w:rPr/>
+            </w:pPr>
+            <w:r>
+              <w:t xml:space="preserve">Date de validation  du rapport par AC</w:t>
+            </w:r>
+            <w:r/>
+            <w:r/>
+          </w:p>
+        </w:tc>
+        <w:tc>
+          <w:tcPr>
+            <w:tcBorders/>
+            <w:tcW w:w="2160" w:type="dxa"/>
+            <w:vMerge w:val="restart"/>
+          </w:tcPr>
+          <w:p>
+            <w:pPr>
+              <w:pBdr/>
+              <w:spacing/>
+              <w:ind/>
+              <w:rPr/>
+            </w:pPr>
+            <w:r>
+              <w:t xml:space="preserve">DATE</w:t>
+            </w:r>
+            <w:r/>
+          </w:p>
+        </w:tc>
+        <w:tc>
+          <w:tcPr>
+            <w:tcBorders/>
+            <w:tcW w:w="2160" w:type="dxa"/>
+            <w:vMerge w:val="restart"/>
+          </w:tcPr>
+          <w:p>
+            <w:pPr>
+              <w:pBdr/>
+              <w:spacing/>
+              <w:ind/>
+              <w:rPr/>
+            </w:pPr>
             <w:r/>
             <w:r/>
           </w:p>
@@ -10196,13 +10005,11 @@
         <w:ind/>
         <w:rPr/>
       </w:pPr>
-      <w:r/>
       <w:r/>
       <w:r/>
     </w:p>
     <w:p>
       <w:pPr>
-        <w:pStyle w:val="838"/>
         <w:pBdr/>
         <w:spacing/>
         <w:ind/>
@@ -10211,7 +10018,6 @@
       <w:r>
         <w:t xml:space="preserve">Classe Paiement</w:t>
       </w:r>
-      <w:r/>
       <w:r/>
     </w:p>
     <w:tbl>
@@ -10245,7 +10051,6 @@
               <w:t xml:space="preserve">Nom</w:t>
             </w:r>
             <w:r/>
-            <w:r/>
           </w:p>
         </w:tc>
         <w:tc>
@@ -10264,7 +10069,6 @@
               <w:t xml:space="preserve">Désignation</w:t>
             </w:r>
             <w:r/>
-            <w:r/>
           </w:p>
         </w:tc>
         <w:tc>
@@ -10283,7 +10087,6 @@
               <w:t xml:space="preserve">Type SQL</w:t>
             </w:r>
             <w:r/>
-            <w:r/>
           </w:p>
         </w:tc>
         <w:tc>
@@ -10301,7 +10104,6 @@
             <w:r>
               <w:t xml:space="preserve">Taille</w:t>
             </w:r>
-            <w:r/>
             <w:r/>
           </w:p>
         </w:tc>
@@ -10324,7 +10126,6 @@
               <w:t xml:space="preserve">id_paiement</w:t>
             </w:r>
             <w:r/>
-            <w:r/>
           </w:p>
         </w:tc>
         <w:tc>
@@ -10343,7 +10144,6 @@
               <w:t xml:space="preserve">Identifiant du paiement</w:t>
             </w:r>
             <w:r/>
-            <w:r/>
           </w:p>
         </w:tc>
         <w:tc>
@@ -10362,7 +10162,6 @@
               <w:t xml:space="preserve">INT</w:t>
             </w:r>
             <w:r/>
-            <w:r/>
           </w:p>
         </w:tc>
         <w:tc>
@@ -10380,7 +10179,6 @@
             <w:r>
               <w:t xml:space="preserve">20</w:t>
             </w:r>
-            <w:r/>
             <w:r/>
           </w:p>
         </w:tc>
@@ -10399,15 +10197,12 @@
               <w:ind/>
               <w:rPr/>
             </w:pPr>
-            <w:r/>
             <w:r>
               <w:t xml:space="preserve">paiement_</w:t>
             </w:r>
-            <w:r/>
             <w:r>
               <w:t xml:space="preserve">montant</w:t>
             </w:r>
-            <w:r/>
             <w:r/>
           </w:p>
         </w:tc>
@@ -10427,7 +10222,6 @@
               <w:t xml:space="preserve">Montant du paiement</w:t>
             </w:r>
             <w:r/>
-            <w:r/>
           </w:p>
         </w:tc>
         <w:tc>
@@ -10446,7 +10240,6 @@
               <w:t xml:space="preserve">DECIMAL</w:t>
             </w:r>
             <w:r/>
-            <w:r/>
           </w:p>
         </w:tc>
         <w:tc>
@@ -10464,7 +10257,6 @@
             <w:r>
               <w:t xml:space="preserve">15,2</w:t>
             </w:r>
-            <w:r/>
             <w:r/>
           </w:p>
         </w:tc>
@@ -10483,15 +10275,12 @@
               <w:ind/>
               <w:rPr/>
             </w:pPr>
-            <w:r/>
             <w:r>
               <w:t xml:space="preserve">paiement_</w:t>
             </w:r>
-            <w:r/>
-            <w:r>
-              <w:t xml:space="preserve">date_paiement</w:t>
-            </w:r>
-            <w:r/>
+            <w:r>
+              <w:t xml:space="preserve">date</w:t>
+            </w:r>
             <w:r/>
           </w:p>
         </w:tc>
@@ -10511,7 +10300,6 @@
               <w:t xml:space="preserve">Date du paiement</w:t>
             </w:r>
             <w:r/>
-            <w:r/>
           </w:p>
         </w:tc>
         <w:tc>
@@ -10530,7 +10318,6 @@
               <w:t xml:space="preserve">DATE</w:t>
             </w:r>
             <w:r/>
-            <w:r/>
           </w:p>
         </w:tc>
         <w:tc>
@@ -10548,7 +10335,6 @@
             <w:r>
               <w:t xml:space="preserve">-</w:t>
             </w:r>
-            <w:r/>
             <w:r/>
           </w:p>
         </w:tc>
@@ -10567,15 +10353,12 @@
               <w:ind/>
               <w:rPr/>
             </w:pPr>
-            <w:r/>
             <w:r>
               <w:t xml:space="preserve">paiement_</w:t>
             </w:r>
-            <w:r/>
             <w:r>
               <w:t xml:space="preserve">mode</w:t>
             </w:r>
-            <w:r/>
             <w:r/>
           </w:p>
         </w:tc>
@@ -10595,7 +10378,6 @@
               <w:t xml:space="preserve">Mode de paiement</w:t>
             </w:r>
             <w:r/>
-            <w:r/>
           </w:p>
         </w:tc>
         <w:tc>
@@ -10614,7 +10396,6 @@
               <w:t xml:space="preserve">ENUM(virement, cheque, especes)</w:t>
             </w:r>
             <w:r/>
-            <w:r/>
           </w:p>
         </w:tc>
         <w:tc>
@@ -10632,7 +10413,6 @@
             <w:r>
               <w:t xml:space="preserve">-</w:t>
             </w:r>
-            <w:r/>
             <w:r/>
           </w:p>
         </w:tc>
@@ -10651,15 +10431,12 @@
               <w:ind/>
               <w:rPr/>
             </w:pPr>
-            <w:r/>
             <w:r>
               <w:t xml:space="preserve">paiement_</w:t>
             </w:r>
-            <w:r/>
             <w:r>
               <w:t xml:space="preserve">reference</w:t>
             </w:r>
-            <w:r/>
             <w:r/>
           </w:p>
         </w:tc>
@@ -10679,7 +10456,6 @@
               <w:t xml:space="preserve">Référence du paiement</w:t>
             </w:r>
             <w:r/>
-            <w:r/>
           </w:p>
         </w:tc>
         <w:tc>
@@ -10698,7 +10474,6 @@
               <w:t xml:space="preserve">VARCHAR</w:t>
             </w:r>
             <w:r/>
-            <w:r/>
           </w:p>
         </w:tc>
         <w:tc>
@@ -10716,7 +10491,6 @@
             <w:r>
               <w:t xml:space="preserve">100</w:t>
             </w:r>
-            <w:r/>
             <w:r/>
           </w:p>
         </w:tc>
@@ -10735,12 +10509,9 @@
               <w:ind/>
               <w:rPr/>
             </w:pPr>
-            <w:r/>
-            <w:r/>
             <w:r>
               <w:t xml:space="preserve">paiement_type</w:t>
             </w:r>
-            <w:r/>
             <w:r/>
           </w:p>
         </w:tc>
@@ -10760,7 +10531,6 @@
               <w:t xml:space="preserve">Type du paiement</w:t>
             </w:r>
             <w:r/>
-            <w:r/>
           </w:p>
         </w:tc>
         <w:tc>
@@ -10779,7 +10549,6 @@
               <w:t xml:space="preserve">ENUM(direct, indirect)</w:t>
             </w:r>
             <w:r/>
-            <w:r/>
           </w:p>
         </w:tc>
         <w:tc>
@@ -10797,6 +10566,82 @@
             <w:r>
               <w:t xml:space="preserve">-</w:t>
             </w:r>
+            <w:r/>
+          </w:p>
+        </w:tc>
+      </w:tr>
+      <w:tr>
+        <w:trPr/>
+        <w:tc>
+          <w:tcPr>
+            <w:tcBorders/>
+            <w:tcW w:w="2160" w:type="dxa"/>
+            <w:vMerge w:val="restart"/>
+          </w:tcPr>
+          <w:p>
+            <w:pPr>
+              <w:pBdr/>
+              <w:spacing/>
+              <w:ind/>
+              <w:rPr/>
+            </w:pPr>
+            <w:r>
+              <w:t xml:space="preserve">Paiement_description</w:t>
+            </w:r>
+            <w:r/>
+          </w:p>
+        </w:tc>
+        <w:tc>
+          <w:tcPr>
+            <w:tcBorders/>
+            <w:tcW w:w="2160" w:type="dxa"/>
+            <w:vMerge w:val="restart"/>
+          </w:tcPr>
+          <w:p>
+            <w:pPr>
+              <w:pBdr/>
+              <w:spacing/>
+              <w:ind/>
+              <w:rPr/>
+            </w:pPr>
+            <w:r>
+              <w:t xml:space="preserve">Description du paiement</w:t>
+            </w:r>
+            <w:r/>
+          </w:p>
+        </w:tc>
+        <w:tc>
+          <w:tcPr>
+            <w:tcBorders/>
+            <w:tcW w:w="2160" w:type="dxa"/>
+            <w:vMerge w:val="restart"/>
+          </w:tcPr>
+          <w:p>
+            <w:pPr>
+              <w:pBdr/>
+              <w:spacing/>
+              <w:ind/>
+              <w:rPr/>
+            </w:pPr>
+            <w:r>
+              <w:t xml:space="preserve">Text</w:t>
+            </w:r>
+            <w:r/>
+          </w:p>
+        </w:tc>
+        <w:tc>
+          <w:tcPr>
+            <w:tcBorders/>
+            <w:tcW w:w="2160" w:type="dxa"/>
+            <w:vMerge w:val="restart"/>
+          </w:tcPr>
+          <w:p>
+            <w:pPr>
+              <w:pBdr/>
+              <w:spacing/>
+              <w:ind/>
+              <w:rPr/>
+            </w:pPr>
             <w:r/>
             <w:r/>
           </w:p>
@@ -10810,13 +10655,11 @@
         <w:ind/>
         <w:rPr/>
       </w:pPr>
-      <w:r/>
       <w:r/>
       <w:r/>
     </w:p>
     <w:p>
       <w:pPr>
-        <w:pStyle w:val="838"/>
         <w:pBdr/>
         <w:spacing/>
         <w:ind/>
@@ -10825,7 +10668,6 @@
       <w:r>
         <w:t xml:space="preserve">Classe Notification</w:t>
       </w:r>
-      <w:r/>
       <w:r/>
     </w:p>
     <w:tbl>
@@ -10859,7 +10701,6 @@
               <w:t xml:space="preserve">Nom</w:t>
             </w:r>
             <w:r/>
-            <w:r/>
           </w:p>
         </w:tc>
         <w:tc>
@@ -10878,7 +10719,6 @@
               <w:t xml:space="preserve">Désignation</w:t>
             </w:r>
             <w:r/>
-            <w:r/>
           </w:p>
         </w:tc>
         <w:tc>
@@ -10897,7 +10737,6 @@
               <w:t xml:space="preserve">Type SQL</w:t>
             </w:r>
             <w:r/>
-            <w:r/>
           </w:p>
         </w:tc>
         <w:tc>
@@ -10915,7 +10754,6 @@
             <w:r>
               <w:t xml:space="preserve">Taille</w:t>
             </w:r>
-            <w:r/>
             <w:r/>
           </w:p>
         </w:tc>
@@ -10938,7 +10776,6 @@
               <w:t xml:space="preserve">id_notification</w:t>
             </w:r>
             <w:r/>
-            <w:r/>
           </w:p>
         </w:tc>
         <w:tc>
@@ -10957,7 +10794,6 @@
               <w:t xml:space="preserve">Identifiant de la notification</w:t>
             </w:r>
             <w:r/>
-            <w:r/>
           </w:p>
         </w:tc>
         <w:tc>
@@ -10976,7 +10812,6 @@
               <w:t xml:space="preserve">INT</w:t>
             </w:r>
             <w:r/>
-            <w:r/>
           </w:p>
         </w:tc>
         <w:tc>
@@ -10994,7 +10829,6 @@
             <w:r>
               <w:t xml:space="preserve">20</w:t>
             </w:r>
-            <w:r/>
             <w:r/>
           </w:p>
         </w:tc>
@@ -11013,15 +10847,12 @@
               <w:ind/>
               <w:rPr/>
             </w:pPr>
-            <w:r/>
             <w:r>
               <w:t xml:space="preserve">notification_</w:t>
             </w:r>
-            <w:r/>
             <w:r>
               <w:t xml:space="preserve">type</w:t>
             </w:r>
-            <w:r/>
             <w:r/>
           </w:p>
         </w:tc>
@@ -11041,7 +10872,6 @@
               <w:t xml:space="preserve">Type de notification</w:t>
             </w:r>
             <w:r/>
-            <w:r/>
           </w:p>
         </w:tc>
         <w:tc>
@@ -11060,7 +10890,6 @@
               <w:t xml:space="preserve">ENUM(demande_statut_change, projet_cloture)</w:t>
             </w:r>
             <w:r/>
-            <w:r/>
           </w:p>
         </w:tc>
         <w:tc>
@@ -11078,7 +10907,6 @@
             <w:r>
               <w:t xml:space="preserve">-</w:t>
             </w:r>
-            <w:r/>
             <w:r/>
           </w:p>
         </w:tc>
@@ -11097,15 +10925,12 @@
               <w:ind/>
               <w:rPr/>
             </w:pPr>
-            <w:r/>
             <w:r>
               <w:t xml:space="preserve">notification_</w:t>
             </w:r>
-            <w:r/>
             <w:r>
               <w:t xml:space="preserve">objet</w:t>
             </w:r>
-            <w:r/>
             <w:r/>
           </w:p>
         </w:tc>
@@ -11125,7 +10950,6 @@
               <w:t xml:space="preserve">Objet de la notification</w:t>
             </w:r>
             <w:r/>
-            <w:r/>
           </w:p>
         </w:tc>
         <w:tc>
@@ -11144,7 +10968,6 @@
               <w:t xml:space="preserve">VARCHAR</w:t>
             </w:r>
             <w:r/>
-            <w:r/>
           </w:p>
         </w:tc>
         <w:tc>
@@ -11162,7 +10985,6 @@
             <w:r>
               <w:t xml:space="preserve">150</w:t>
             </w:r>
-            <w:r/>
             <w:r/>
           </w:p>
         </w:tc>
@@ -11181,11 +11003,9 @@
               <w:ind/>
               <w:rPr/>
             </w:pPr>
-            <w:r/>
             <w:r>
               <w:t xml:space="preserve">notification_libelle</w:t>
             </w:r>
-            <w:r/>
             <w:r/>
           </w:p>
         </w:tc>
@@ -11205,7 +11025,6 @@
               <w:t xml:space="preserve">Libellé du statut</w:t>
             </w:r>
             <w:r/>
-            <w:r/>
           </w:p>
         </w:tc>
         <w:tc>
@@ -11224,7 +11043,6 @@
               <w:t xml:space="preserve">VARCHAR</w:t>
             </w:r>
             <w:r/>
-            <w:r/>
           </w:p>
         </w:tc>
         <w:tc>
@@ -11242,7 +11060,6 @@
             <w:r>
               <w:t xml:space="preserve">100</w:t>
             </w:r>
-            <w:r/>
             <w:r/>
           </w:p>
         </w:tc>
@@ -11261,15 +11078,12 @@
               <w:ind/>
               <w:rPr/>
             </w:pPr>
-            <w:r/>
             <w:r>
               <w:t xml:space="preserve">notification_</w:t>
             </w:r>
-            <w:r/>
             <w:r>
               <w:t xml:space="preserve">motif</w:t>
             </w:r>
-            <w:r/>
             <w:r/>
           </w:p>
         </w:tc>
@@ -11289,7 +11103,6 @@
               <w:t xml:space="preserve">Motif associé</w:t>
             </w:r>
             <w:r/>
-            <w:r/>
           </w:p>
         </w:tc>
         <w:tc>
@@ -11308,7 +11121,6 @@
               <w:t xml:space="preserve">TEXT</w:t>
             </w:r>
             <w:r/>
-            <w:r/>
           </w:p>
         </w:tc>
         <w:tc>
@@ -11326,7 +11138,6 @@
             <w:r>
               <w:t xml:space="preserve">-</w:t>
             </w:r>
-            <w:r/>
             <w:r/>
           </w:p>
         </w:tc>
@@ -11345,15 +11156,12 @@
               <w:ind/>
               <w:rPr/>
             </w:pPr>
-            <w:r/>
             <w:r>
               <w:t xml:space="preserve">notification_</w:t>
             </w:r>
-            <w:r/>
             <w:r>
               <w:t xml:space="preserve">lu_le</w:t>
             </w:r>
-            <w:r/>
             <w:r/>
           </w:p>
         </w:tc>
@@ -11373,7 +11181,6 @@
               <w:t xml:space="preserve">Date de lecture</w:t>
             </w:r>
             <w:r/>
-            <w:r/>
           </w:p>
         </w:tc>
         <w:tc>
@@ -11392,7 +11199,6 @@
               <w:t xml:space="preserve">DATE</w:t>
             </w:r>
             <w:r/>
-            <w:r/>
           </w:p>
         </w:tc>
         <w:tc>
@@ -11410,7 +11216,6 @@
             <w:r>
               <w:t xml:space="preserve">-</w:t>
             </w:r>
-            <w:r/>
             <w:r/>
           </w:p>
         </w:tc>
@@ -11423,13 +11228,11 @@
         <w:ind/>
         <w:rPr/>
       </w:pPr>
-      <w:r/>
       <w:r/>
       <w:r/>
     </w:p>
     <w:p>
       <w:pPr>
-        <w:pStyle w:val="838"/>
         <w:pBdr/>
         <w:spacing/>
         <w:ind/>
@@ -11438,7 +11241,6 @@
       <w:r>
         <w:t xml:space="preserve">Classe Message_chat</w:t>
       </w:r>
-      <w:r/>
       <w:r/>
     </w:p>
     <w:tbl>
@@ -11472,7 +11274,6 @@
               <w:t xml:space="preserve">Nom</w:t>
             </w:r>
             <w:r/>
-            <w:r/>
           </w:p>
         </w:tc>
         <w:tc>
@@ -11491,7 +11292,6 @@
               <w:t xml:space="preserve">Désignation</w:t>
             </w:r>
             <w:r/>
-            <w:r/>
           </w:p>
         </w:tc>
         <w:tc>
@@ -11510,7 +11310,6 @@
               <w:t xml:space="preserve">Type SQL</w:t>
             </w:r>
             <w:r/>
-            <w:r/>
           </w:p>
         </w:tc>
         <w:tc>
@@ -11528,7 +11327,6 @@
             <w:r>
               <w:t xml:space="preserve">Taille</w:t>
             </w:r>
-            <w:r/>
             <w:r/>
           </w:p>
         </w:tc>
@@ -11551,7 +11349,6 @@
               <w:t xml:space="preserve">id_message</w:t>
             </w:r>
             <w:r/>
-            <w:r/>
           </w:p>
         </w:tc>
         <w:tc>
@@ -11570,7 +11367,6 @@
               <w:t xml:space="preserve">Identifiant du message</w:t>
             </w:r>
             <w:r/>
-            <w:r/>
           </w:p>
         </w:tc>
         <w:tc>
@@ -11589,7 +11385,6 @@
               <w:t xml:space="preserve">INT</w:t>
             </w:r>
             <w:r/>
-            <w:r/>
           </w:p>
         </w:tc>
         <w:tc>
@@ -11607,7 +11402,6 @@
             <w:r>
               <w:t xml:space="preserve">20</w:t>
             </w:r>
-            <w:r/>
             <w:r/>
           </w:p>
         </w:tc>
@@ -11630,7 +11424,6 @@
               <w:t xml:space="preserve">message_contenu</w:t>
             </w:r>
             <w:r/>
-            <w:r/>
           </w:p>
         </w:tc>
         <w:tc>
@@ -11649,7 +11442,6 @@
               <w:t xml:space="preserve">Contenu du message</w:t>
             </w:r>
             <w:r/>
-            <w:r/>
           </w:p>
         </w:tc>
         <w:tc>
@@ -11668,7 +11460,6 @@
               <w:t xml:space="preserve">TEXT</w:t>
             </w:r>
             <w:r/>
-            <w:r/>
           </w:p>
         </w:tc>
         <w:tc>
@@ -11686,7 +11477,6 @@
             <w:r>
               <w:t xml:space="preserve">-</w:t>
             </w:r>
-            <w:r/>
             <w:r/>
           </w:p>
         </w:tc>
@@ -11709,7 +11499,6 @@
               <w:t xml:space="preserve">message_lu</w:t>
             </w:r>
             <w:r/>
-            <w:r/>
           </w:p>
         </w:tc>
         <w:tc>
@@ -11728,7 +11517,6 @@
               <w:t xml:space="preserve">État de lecture du message</w:t>
             </w:r>
             <w:r/>
-            <w:r/>
           </w:p>
         </w:tc>
         <w:tc>
@@ -11747,7 +11535,6 @@
               <w:t xml:space="preserve">BOOLEAN</w:t>
             </w:r>
             <w:r/>
-            <w:r/>
           </w:p>
         </w:tc>
         <w:tc>
@@ -11765,7 +11552,6 @@
             <w:r>
               <w:t xml:space="preserve">1</w:t>
             </w:r>
-            <w:r/>
             <w:r/>
           </w:p>
         </w:tc>
@@ -11778,13 +11564,11 @@
         <w:ind/>
         <w:rPr/>
       </w:pPr>
-      <w:r/>
       <w:r/>
       <w:r/>
     </w:p>
     <w:p>
       <w:pPr>
-        <w:pStyle w:val="838"/>
         <w:pBdr/>
         <w:spacing/>
         <w:ind/>
@@ -11793,7 +11577,6 @@
       <w:r>
         <w:t xml:space="preserve">Classe Journal_audit</w:t>
       </w:r>
-      <w:r/>
       <w:r/>
     </w:p>
     <w:tbl>
@@ -11827,7 +11610,6 @@
               <w:t xml:space="preserve">Nom</w:t>
             </w:r>
             <w:r/>
-            <w:r/>
           </w:p>
         </w:tc>
         <w:tc>
@@ -11846,7 +11628,6 @@
               <w:t xml:space="preserve">Désignation</w:t>
             </w:r>
             <w:r/>
-            <w:r/>
           </w:p>
         </w:tc>
         <w:tc>
@@ -11865,7 +11646,6 @@
               <w:t xml:space="preserve">Type SQL</w:t>
             </w:r>
             <w:r/>
-            <w:r/>
           </w:p>
         </w:tc>
         <w:tc>
@@ -11883,7 +11663,6 @@
             <w:r>
               <w:t xml:space="preserve">Taille</w:t>
             </w:r>
-            <w:r/>
             <w:r/>
           </w:p>
         </w:tc>
@@ -11906,7 +11685,6 @@
               <w:t xml:space="preserve">id_audit</w:t>
             </w:r>
             <w:r/>
-            <w:r/>
           </w:p>
         </w:tc>
         <w:tc>
@@ -11925,7 +11703,6 @@
               <w:t xml:space="preserve">Identifiant du journal</w:t>
             </w:r>
             <w:r/>
-            <w:r/>
           </w:p>
         </w:tc>
         <w:tc>
@@ -11944,7 +11721,6 @@
               <w:t xml:space="preserve">INT</w:t>
             </w:r>
             <w:r/>
-            <w:r/>
           </w:p>
         </w:tc>
         <w:tc>
@@ -11962,7 +11738,6 @@
             <w:r>
               <w:t xml:space="preserve">20</w:t>
             </w:r>
-            <w:r/>
             <w:r/>
           </w:p>
         </w:tc>
@@ -11981,15 +11756,12 @@
               <w:ind/>
               <w:rPr/>
             </w:pPr>
-            <w:r/>
             <w:r>
               <w:t xml:space="preserve">audit_</w:t>
             </w:r>
-            <w:r/>
             <w:r>
               <w:t xml:space="preserve">action</w:t>
             </w:r>
-            <w:r/>
             <w:r/>
           </w:p>
         </w:tc>
@@ -12009,7 +11781,6 @@
               <w:t xml:space="preserve">Action effectuée</w:t>
             </w:r>
             <w:r/>
-            <w:r/>
           </w:p>
         </w:tc>
         <w:tc>
@@ -12028,7 +11799,6 @@
               <w:t xml:space="preserve">VARCHAR</w:t>
             </w:r>
             <w:r/>
-            <w:r/>
           </w:p>
         </w:tc>
         <w:tc>
@@ -12046,7 +11816,6 @@
             <w:r>
               <w:t xml:space="preserve">100</w:t>
             </w:r>
-            <w:r/>
             <w:r/>
           </w:p>
         </w:tc>
@@ -12065,15 +11834,12 @@
               <w:ind/>
               <w:rPr/>
             </w:pPr>
-            <w:r/>
             <w:r>
               <w:t xml:space="preserve">audit_</w:t>
             </w:r>
-            <w:r/>
             <w:r>
               <w:t xml:space="preserve">anciennes_valeurs</w:t>
             </w:r>
-            <w:r/>
             <w:r/>
           </w:p>
         </w:tc>
@@ -12093,7 +11859,6 @@
               <w:t xml:space="preserve">Anciennes valeurs</w:t>
             </w:r>
             <w:r/>
-            <w:r/>
           </w:p>
         </w:tc>
         <w:tc>
@@ -12112,7 +11877,6 @@
               <w:t xml:space="preserve">TEXT</w:t>
             </w:r>
             <w:r/>
-            <w:r/>
           </w:p>
         </w:tc>
         <w:tc>
@@ -12130,7 +11894,6 @@
             <w:r>
               <w:t xml:space="preserve">-</w:t>
             </w:r>
-            <w:r/>
             <w:r/>
           </w:p>
         </w:tc>
@@ -12149,15 +11912,12 @@
               <w:ind/>
               <w:rPr/>
             </w:pPr>
-            <w:r/>
             <w:r>
               <w:t xml:space="preserve">audit_</w:t>
             </w:r>
-            <w:r/>
             <w:r>
               <w:t xml:space="preserve">nouvelles_valeurs</w:t>
             </w:r>
-            <w:r/>
             <w:r/>
           </w:p>
         </w:tc>
@@ -12177,7 +11937,6 @@
               <w:t xml:space="preserve">Nouvelles valeurs</w:t>
             </w:r>
             <w:r/>
-            <w:r/>
           </w:p>
         </w:tc>
         <w:tc>
@@ -12196,7 +11955,6 @@
               <w:t xml:space="preserve">TEXT</w:t>
             </w:r>
             <w:r/>
-            <w:r/>
           </w:p>
         </w:tc>
         <w:tc>
@@ -12214,7 +11972,6 @@
             <w:r>
               <w:t xml:space="preserve">-</w:t>
             </w:r>
-            <w:r/>
             <w:r/>
           </w:p>
         </w:tc>
@@ -12233,15 +11990,12 @@
               <w:ind/>
               <w:rPr/>
             </w:pPr>
-            <w:r/>
             <w:r>
               <w:t xml:space="preserve">audit_</w:t>
             </w:r>
-            <w:r/>
             <w:r>
               <w:t xml:space="preserve">adresse_ip</w:t>
             </w:r>
-            <w:r/>
             <w:r/>
           </w:p>
         </w:tc>
@@ -12261,7 +12015,6 @@
               <w:t xml:space="preserve">Adresse IP</w:t>
             </w:r>
             <w:r/>
-            <w:r/>
           </w:p>
         </w:tc>
         <w:tc>
@@ -12280,7 +12033,6 @@
               <w:t xml:space="preserve">VARCHAR</w:t>
             </w:r>
             <w:r/>
-            <w:r/>
           </w:p>
         </w:tc>
         <w:tc>
@@ -12298,7 +12050,6 @@
             <w:r>
               <w:t xml:space="preserve">50</w:t>
             </w:r>
-            <w:r/>
             <w:r/>
           </w:p>
         </w:tc>
@@ -12317,15 +12068,12 @@
               <w:ind/>
               <w:rPr/>
             </w:pPr>
-            <w:r/>
             <w:r>
               <w:t xml:space="preserve">audit_</w:t>
             </w:r>
-            <w:r/>
             <w:r>
               <w:t xml:space="preserve">navigateur</w:t>
             </w:r>
-            <w:r/>
             <w:r/>
           </w:p>
         </w:tc>
@@ -12345,7 +12093,6 @@
               <w:t xml:space="preserve">Navigateur utilisé</w:t>
             </w:r>
             <w:r/>
-            <w:r/>
           </w:p>
         </w:tc>
         <w:tc>
@@ -12364,7 +12111,6 @@
               <w:t xml:space="preserve">VARCHAR</w:t>
             </w:r>
             <w:r/>
-            <w:r/>
           </w:p>
         </w:tc>
         <w:tc>
@@ -12382,7 +12128,6 @@
             <w:r>
               <w:t xml:space="preserve">100</w:t>
             </w:r>
-            <w:r/>
             <w:r/>
           </w:p>
         </w:tc>
@@ -12401,15 +12146,12 @@
               <w:ind/>
               <w:rPr/>
             </w:pPr>
-            <w:r/>
             <w:r>
               <w:t xml:space="preserve">audit_</w:t>
             </w:r>
-            <w:r/>
             <w:r>
               <w:t xml:space="preserve">description</w:t>
             </w:r>
-            <w:r/>
             <w:r/>
           </w:p>
         </w:tc>
@@ -12429,7 +12171,6 @@
               <w:t xml:space="preserve">Description de l'action</w:t>
             </w:r>
             <w:r/>
-            <w:r/>
           </w:p>
         </w:tc>
         <w:tc>
@@ -12448,7 +12189,6 @@
               <w:t xml:space="preserve">TEXT</w:t>
             </w:r>
             <w:r/>
-            <w:r/>
           </w:p>
         </w:tc>
         <w:tc>
@@ -12466,7 +12206,6 @@
             <w:r>
               <w:t xml:space="preserve">-</w:t>
             </w:r>
-            <w:r/>
             <w:r/>
           </w:p>
         </w:tc>
@@ -12479,13 +12218,11 @@
         <w:ind/>
         <w:rPr/>
       </w:pPr>
-      <w:r/>
       <w:r/>
       <w:r/>
     </w:p>
     <w:p>
       <w:pPr>
-        <w:pStyle w:val="838"/>
         <w:pBdr/>
         <w:spacing/>
         <w:ind/>
@@ -12494,7 +12231,6 @@
       <w:r>
         <w:t xml:space="preserve">Classe Faq</w:t>
       </w:r>
-      <w:r/>
       <w:r/>
     </w:p>
     <w:tbl>
@@ -12528,7 +12264,6 @@
               <w:t xml:space="preserve">Nom</w:t>
             </w:r>
             <w:r/>
-            <w:r/>
           </w:p>
         </w:tc>
         <w:tc>
@@ -12547,7 +12282,6 @@
               <w:t xml:space="preserve">Désignation</w:t>
             </w:r>
             <w:r/>
-            <w:r/>
           </w:p>
         </w:tc>
         <w:tc>
@@ -12566,7 +12300,6 @@
               <w:t xml:space="preserve">Type SQL</w:t>
             </w:r>
             <w:r/>
-            <w:r/>
           </w:p>
         </w:tc>
         <w:tc>
@@ -12584,7 +12317,6 @@
             <w:r>
               <w:t xml:space="preserve">Taille</w:t>
             </w:r>
-            <w:r/>
             <w:r/>
           </w:p>
         </w:tc>
@@ -12607,7 +12339,6 @@
               <w:t xml:space="preserve">id_faq</w:t>
             </w:r>
             <w:r/>
-            <w:r/>
           </w:p>
         </w:tc>
         <w:tc>
@@ -12626,7 +12357,6 @@
               <w:t xml:space="preserve">Identifiant de la FAQ</w:t>
             </w:r>
             <w:r/>
-            <w:r/>
           </w:p>
         </w:tc>
         <w:tc>
@@ -12645,7 +12375,6 @@
               <w:t xml:space="preserve">INT</w:t>
             </w:r>
             <w:r/>
-            <w:r/>
           </w:p>
         </w:tc>
         <w:tc>
@@ -12663,7 +12392,6 @@
             <w:r>
               <w:t xml:space="preserve">20</w:t>
             </w:r>
-            <w:r/>
             <w:r/>
           </w:p>
         </w:tc>
@@ -12682,15 +12410,12 @@
               <w:ind/>
               <w:rPr/>
             </w:pPr>
-            <w:r/>
             <w:r>
               <w:t xml:space="preserve">faq_</w:t>
             </w:r>
-            <w:r/>
             <w:r>
               <w:t xml:space="preserve">question</w:t>
             </w:r>
-            <w:r/>
             <w:r/>
           </w:p>
         </w:tc>
@@ -12710,7 +12435,6 @@
               <w:t xml:space="preserve">Question fréquente</w:t>
             </w:r>
             <w:r/>
-            <w:r/>
           </w:p>
         </w:tc>
         <w:tc>
@@ -12729,7 +12453,6 @@
               <w:t xml:space="preserve">VARCHAR</w:t>
             </w:r>
             <w:r/>
-            <w:r/>
           </w:p>
         </w:tc>
         <w:tc>
@@ -12747,7 +12470,6 @@
             <w:r>
               <w:t xml:space="preserve">255</w:t>
             </w:r>
-            <w:r/>
             <w:r/>
           </w:p>
         </w:tc>
@@ -12766,15 +12488,12 @@
               <w:ind/>
               <w:rPr/>
             </w:pPr>
-            <w:r/>
             <w:r>
               <w:t xml:space="preserve">faq_</w:t>
             </w:r>
-            <w:r/>
             <w:r>
               <w:t xml:space="preserve">reponse</w:t>
             </w:r>
-            <w:r/>
             <w:r/>
           </w:p>
         </w:tc>
@@ -12794,7 +12513,6 @@
               <w:t xml:space="preserve">Réponse associée</w:t>
             </w:r>
             <w:r/>
-            <w:r/>
           </w:p>
         </w:tc>
         <w:tc>
@@ -12813,7 +12531,6 @@
               <w:t xml:space="preserve">TEXT</w:t>
             </w:r>
             <w:r/>
-            <w:r/>
           </w:p>
         </w:tc>
         <w:tc>
@@ -12831,7 +12548,6 @@
             <w:r>
               <w:t xml:space="preserve">-</w:t>
             </w:r>
-            <w:r/>
             <w:r/>
           </w:p>
         </w:tc>
@@ -12850,15 +12566,12 @@
               <w:ind/>
               <w:rPr/>
             </w:pPr>
-            <w:r/>
             <w:r>
               <w:t xml:space="preserve">faq_</w:t>
             </w:r>
-            <w:r/>
             <w:r>
               <w:t xml:space="preserve">actif</w:t>
             </w:r>
-            <w:r/>
             <w:r/>
           </w:p>
         </w:tc>
@@ -12878,7 +12591,6 @@
               <w:t xml:space="preserve">État de publication</w:t>
             </w:r>
             <w:r/>
-            <w:r/>
           </w:p>
         </w:tc>
         <w:tc>
@@ -12897,7 +12609,6 @@
               <w:t xml:space="preserve">BOOLEAN</w:t>
             </w:r>
             <w:r/>
-            <w:r/>
           </w:p>
         </w:tc>
         <w:tc>
@@ -12915,7 +12626,6 @@
             <w:r>
               <w:t xml:space="preserve">1</w:t>
             </w:r>
-            <w:r/>
             <w:r/>
           </w:p>
         </w:tc>
@@ -12977,10 +12687,6 @@
               <w:t xml:space="preserve">BOOLEAN</w:t>
             </w:r>
             <w:r/>
-            <w:r/>
-            <w:r/>
-            <w:r/>
-            <w:r/>
           </w:p>
         </w:tc>
         <w:tc>
@@ -13022,7 +12728,6 @@
               <w:t xml:space="preserve">Visible_ac</w:t>
             </w:r>
             <w:r/>
-            <w:r/>
           </w:p>
           <w:p>
             <w:pPr>
@@ -13052,7 +12757,6 @@
               <w:t xml:space="preserve">Peux etre vue par un ac</w:t>
             </w:r>
             <w:r/>
-            <w:r/>
           </w:p>
         </w:tc>
         <w:tc>
@@ -13072,7 +12776,6 @@
               <w:t xml:space="preserve">BOOLEAN</w:t>
             </w:r>
             <w:r/>
-            <w:r/>
           </w:p>
           <w:p>
             <w:pPr>
@@ -13124,7 +12827,6 @@
               <w:t xml:space="preserve">Visible_porteur</w:t>
             </w:r>
             <w:r/>
-            <w:r/>
           </w:p>
           <w:p>
             <w:pPr>
@@ -13154,7 +12856,6 @@
               <w:t xml:space="preserve">Peux etre vue par un porteur de projet</w:t>
             </w:r>
             <w:r/>
-            <w:r/>
           </w:p>
         </w:tc>
         <w:tc>
@@ -13174,7 +12875,6 @@
               <w:t xml:space="preserve">BOOLEAN</w:t>
             </w:r>
             <w:r/>
-            <w:r/>
           </w:p>
           <w:p>
             <w:pPr>
@@ -13215,7 +12915,6 @@
         <w:ind/>
         <w:rPr/>
       </w:pPr>
-      <w:r/>
       <w:r/>
       <w:r/>
     </w:p>
@@ -13239,7 +12938,6 @@
         <w:t xml:space="preserve">4.5 Diagramme de classes</w:t>
       </w:r>
       <w:r/>
-      <w:r/>
     </w:p>
     <w:p>
       <w:pPr>
@@ -13275,60 +12973,6 @@
       </w:r>
       <w:r>
         <w:t xml:space="preserve">tion facilite la compréhension globale du fonctionnement du système et sert de base pour la conception de la base de données et au developpement de l’application.</w:t>
-      </w:r>
-      <w:r>
-        <w:rPr>
-          <w:rFonts w:ascii="Arial" w:hAnsi="Arial" w:eastAsia="Arial" w:cs="Arial"/>
-          <w:sz w:val="24"/>
-          <w:szCs w:val="24"/>
-        </w:rPr>
-      </w:r>
-      <w:r>
-        <w:rPr>
-          <w:rFonts w:ascii="Arial" w:hAnsi="Arial" w:eastAsia="Arial" w:cs="Arial"/>
-          <w:sz w:val="24"/>
-          <w:szCs w:val="24"/>
-        </w:rPr>
-      </w:r>
-      <w:r>
-        <w:rPr>
-          <w:rFonts w:ascii="Arial" w:hAnsi="Arial" w:eastAsia="Arial" w:cs="Arial"/>
-          <w:sz w:val="24"/>
-          <w:szCs w:val="24"/>
-          <w:highlight w:val="none"/>
-        </w:rPr>
-      </w:r>
-      <w:r>
-        <w:rPr>
-          <w:rFonts w:ascii="Arial" w:hAnsi="Arial" w:eastAsia="Arial" w:cs="Arial"/>
-          <w:sz w:val="24"/>
-          <w:szCs w:val="24"/>
-          <w:highlight w:val="none"/>
-        </w:rPr>
-      </w:r>
-      <w:r>
-        <w:rPr>
-          <w:rFonts w:ascii="Arial" w:hAnsi="Arial" w:eastAsia="Arial" w:cs="Arial"/>
-          <w:sz w:val="24"/>
-          <w:szCs w:val="24"/>
-          <w:highlight w:val="none"/>
-        </w:rPr>
-      </w:r>
-      <w:r>
-        <w:rPr>
-          <w:rFonts w:ascii="Arial" w:hAnsi="Arial" w:eastAsia="Arial" w:cs="Arial"/>
-          <w:sz w:val="24"/>
-          <w:szCs w:val="24"/>
-          <w:highlight w:val="none"/>
-        </w:rPr>
-      </w:r>
-      <w:r>
-        <w:rPr>
-          <w:rFonts w:ascii="Arial" w:hAnsi="Arial" w:eastAsia="Arial" w:cs="Arial"/>
-          <w:sz w:val="24"/>
-          <w:szCs w:val="24"/>
-          <w:highlight w:val="none"/>
-        </w:rPr>
       </w:r>
       <w:r>
         <w:rPr>
@@ -13370,7 +13014,7 @@
           <mc:Choice Requires="wpg">
             <w:drawing>
               <wp:inline xmlns:wp="http://schemas.openxmlformats.org/drawingml/2006/wordprocessingDrawing" distT="0" distB="0" distL="0" distR="0">
-                <wp:extent cx="8110097" cy="4645365"/>
+                <wp:extent cx="5940425" cy="2914214"/>
                 <wp:effectExtent l="0" t="0" r="0" b="0"/>
                 <wp:docPr id="1" name=""/>
                 <wp:cNvGraphicFramePr>
@@ -13380,7 +13024,7 @@
                   <a:graphicData uri="http://schemas.openxmlformats.org/drawingml/2006/picture">
                     <pic:pic xmlns:pic="http://schemas.openxmlformats.org/drawingml/2006/picture">
                       <pic:nvPicPr>
-                        <pic:cNvPr id="122505012" name=""/>
+                        <pic:cNvPr id="1165643542" name=""/>
                         <pic:cNvPicPr>
                           <a:picLocks noChangeAspect="1"/>
                         </pic:cNvPicPr>
@@ -13397,9 +13041,9 @@
                         <a:stretch/>
                       </pic:blipFill>
                       <pic:spPr bwMode="auto">
-                        <a:xfrm rot="5400000" flipH="0" flipV="0">
+                        <a:xfrm>
                           <a:off x="0" y="0"/>
-                          <a:ext cx="8110097" cy="4645364"/>
+                          <a:ext cx="5940424" cy="2914213"/>
                         </a:xfrm>
                         <a:prstGeom prst="rect">
                           <a:avLst/>
@@ -13432,7 +13076,7 @@
                 <v:path o:extrusionok="f" gradientshapeok="t" o:connecttype="rect"/>
                 <o:lock v:ext="edit" aspectratio="t"/>
               </v:shapetype>
-              <v:shape id="_x0000_i0" o:spid="_x0000_s0" type="#_x0000_t75" style="width:638.59pt;height:365.78pt;mso-wrap-distance-left:0.00pt;mso-wrap-distance-top:0.00pt;mso-wrap-distance-right:0.00pt;mso-wrap-distance-bottom:0.00pt;rotation:90;z-index:1;" stroked="false">
+              <v:shape id="_x0000_i0" o:spid="_x0000_s0" type="#_x0000_t75" style="width:467.75pt;height:229.47pt;mso-wrap-distance-left:0.00pt;mso-wrap-distance-top:0.00pt;mso-wrap-distance-right:0.00pt;mso-wrap-distance-bottom:0.00pt;z-index:1;" stroked="false">
                 <v:imagedata r:id="rId9" o:title=""/>
                 <o:lock v:ext="edit" rotation="t"/>
               </v:shape>
@@ -13440,6 +13084,35 @@
           </mc:Fallback>
         </mc:AlternateContent>
       </w:r>
+      <w:r>
+        <w:rPr>
+          <w:rFonts w:ascii="Arial" w:hAnsi="Arial" w:eastAsia="Arial" w:cs="Arial"/>
+          <w:sz w:val="24"/>
+          <w:szCs w:val="24"/>
+          <w:highlight w:val="none"/>
+        </w:rPr>
+      </w:r>
+      <w:r>
+        <w:rPr>
+          <w:rFonts w:ascii="Arial" w:hAnsi="Arial" w:eastAsia="Arial" w:cs="Arial"/>
+          <w:sz w:val="24"/>
+          <w:szCs w:val="24"/>
+          <w:highlight w:val="none"/>
+        </w:rPr>
+      </w:r>
+    </w:p>
+    <w:p>
+      <w:pPr>
+        <w:pBdr/>
+        <w:spacing/>
+        <w:ind w:firstLine="0"/>
+        <w:rPr>
+          <w:rFonts w:ascii="Arial" w:hAnsi="Arial" w:eastAsia="Arial" w:cs="Arial"/>
+          <w:sz w:val="24"/>
+          <w:szCs w:val="24"/>
+          <w:highlight w:val="none"/>
+        </w:rPr>
+      </w:pPr>
       <w:r>
         <w:rPr>
           <w:rFonts w:ascii="Arial" w:hAnsi="Arial" w:eastAsia="Arial" w:cs="Arial"/>
@@ -13484,13 +13157,11 @@
           <w:szCs w:val="24"/>
           <w:highlight w:val="none"/>
         </w:rPr>
-      </w:r>
-      <w:r>
         <mc:AlternateContent>
           <mc:Choice Requires="wpg">
             <w:drawing>
               <wp:inline xmlns:wp="http://schemas.openxmlformats.org/drawingml/2006/wordprocessingDrawing" distT="0" distB="0" distL="0" distR="0">
-                <wp:extent cx="5940425" cy="5220624"/>
+                <wp:extent cx="5940425" cy="2564479"/>
                 <wp:effectExtent l="0" t="0" r="0" b="0"/>
                 <wp:docPr id="2" name=""/>
                 <wp:cNvGraphicFramePr>
@@ -13500,7 +13171,7 @@
                   <a:graphicData uri="http://schemas.openxmlformats.org/drawingml/2006/picture">
                     <pic:pic xmlns:pic="http://schemas.openxmlformats.org/drawingml/2006/picture">
                       <pic:nvPicPr>
-                        <pic:cNvPr id="1717057142" name=""/>
+                        <pic:cNvPr id="188245843" name=""/>
                         <pic:cNvPicPr>
                           <a:picLocks noChangeAspect="1"/>
                         </pic:cNvPicPr>
@@ -13513,7 +13184,7 @@
                       <pic:spPr bwMode="auto">
                         <a:xfrm>
                           <a:off x="0" y="0"/>
-                          <a:ext cx="5940424" cy="5220623"/>
+                          <a:ext cx="5940424" cy="2564479"/>
                         </a:xfrm>
                         <a:prstGeom prst="rect">
                           <a:avLst/>
@@ -13546,13 +13217,22 @@
                 <v:path o:extrusionok="f" gradientshapeok="t" o:connecttype="rect"/>
                 <o:lock v:ext="edit" aspectratio="t"/>
               </v:shapetype>
-              <v:shape id="_x0000_i1" o:spid="_x0000_s1" type="#_x0000_t75" style="width:467.75pt;height:411.07pt;mso-wrap-distance-left:0.00pt;mso-wrap-distance-top:0.00pt;mso-wrap-distance-right:0.00pt;mso-wrap-distance-bottom:0.00pt;z-index:1;" stroked="false">
+              <v:shape id="_x0000_i1" o:spid="_x0000_s1" type="#_x0000_t75" style="width:467.75pt;height:201.93pt;mso-wrap-distance-left:0.00pt;mso-wrap-distance-top:0.00pt;mso-wrap-distance-right:0.00pt;mso-wrap-distance-bottom:0.00pt;z-index:1;" stroked="false">
                 <v:imagedata r:id="rId11" o:title=""/>
                 <o:lock v:ext="edit" rotation="t"/>
               </v:shape>
             </w:pict>
           </mc:Fallback>
         </mc:AlternateContent>
+      </w:r>
+      <w:r/>
+      <w:r>
+        <w:rPr>
+          <w:rFonts w:ascii="Arial" w:hAnsi="Arial" w:eastAsia="Arial" w:cs="Arial"/>
+          <w:sz w:val="24"/>
+          <w:szCs w:val="24"/>
+          <w:highlight w:val="none"/>
+        </w:rPr>
       </w:r>
       <w:r>
         <w:rPr>
@@ -13561,6 +13241,29 @@
           <w:szCs w:val="24"/>
           <w:highlight w:val="none"/>
         </w:rPr>
+      </w:r>
+    </w:p>
+    <w:p>
+      <w:pPr>
+        <w:pStyle w:val="838"/>
+        <w:pBdr/>
+        <w:spacing/>
+        <w:ind/>
+        <w:rPr>
+          <w:rFonts w:ascii="Arial" w:hAnsi="Arial" w:eastAsia="Arial" w:cs="Arial"/>
+          <w:sz w:val="24"/>
+          <w:szCs w:val="24"/>
+          <w:highlight w:val="none"/>
+        </w:rPr>
+      </w:pPr>
+      <w:r>
+        <w:rPr>
+          <w:rFonts w:ascii="Arial" w:hAnsi="Arial" w:eastAsia="Arial" w:cs="Arial"/>
+          <w:sz w:val="24"/>
+          <w:szCs w:val="24"/>
+          <w:highlight w:val="none"/>
+        </w:rPr>
+        <w:t xml:space="preserve">4.6. Conclusion</w:t>
       </w:r>
       <w:r>
         <w:rPr>
@@ -13591,44 +13294,6 @@
           <w:highlight w:val="none"/>
         </w:rPr>
       </w:pPr>
-      <w:r>
-        <w:rPr>
-          <w:rFonts w:ascii="Arial" w:hAnsi="Arial" w:eastAsia="Arial" w:cs="Arial"/>
-          <w:sz w:val="24"/>
-          <w:szCs w:val="24"/>
-          <w:highlight w:val="none"/>
-        </w:rPr>
-        <w:t xml:space="preserve">Conclusion</w:t>
-      </w:r>
-      <w:r>
-        <w:rPr>
-          <w:rFonts w:ascii="Arial" w:hAnsi="Arial" w:eastAsia="Arial" w:cs="Arial"/>
-          <w:sz w:val="24"/>
-          <w:szCs w:val="24"/>
-          <w:highlight w:val="none"/>
-        </w:rPr>
-      </w:r>
-    </w:p>
-    <w:p>
-      <w:pPr>
-        <w:pBdr/>
-        <w:spacing/>
-        <w:ind w:firstLine="0"/>
-        <w:rPr>
-          <w:rFonts w:ascii="Arial" w:hAnsi="Arial" w:eastAsia="Arial" w:cs="Arial"/>
-          <w:sz w:val="24"/>
-          <w:szCs w:val="24"/>
-          <w:highlight w:val="none"/>
-        </w:rPr>
-      </w:pPr>
-      <w:r>
-        <w:rPr>
-          <w:rFonts w:ascii="Arial" w:hAnsi="Arial" w:eastAsia="Arial" w:cs="Arial"/>
-          <w:sz w:val="24"/>
-          <w:szCs w:val="24"/>
-          <w:highlight w:val="none"/>
-        </w:rPr>
-      </w:r>
       <w:r>
         <w:rPr>
           <w:rFonts w:ascii="Arial" w:hAnsi="Arial" w:eastAsia="Arial" w:cs="Arial"/>

</xml_diff>